<commit_message>
fix(report): fix report for 11th sprint
VM-163
</commit_message>
<xml_diff>
--- a/docs/report/11 спринт 24-05-25.docx
+++ b/docs/report/11 спринт 24-05-25.docx
@@ -694,6 +694,397 @@
         </w:rPr>
         <w:t>приложения.</w:t>
       </w:r>
+    </w:p>
+    <w:p>
+      <w:pPr>
+        <w:spacing w:line="240" w:lineRule="auto"/>
+        <w:rPr>
+          <w:rStyle w:val="translatable-message"/>
+          <w:rFonts w:ascii="Times New Roman" w:hAnsi="Times New Roman" w:cs="Times New Roman"/>
+          <w:b/>
+          <w:sz w:val="28"/>
+          <w:szCs w:val="28"/>
+        </w:rPr>
+      </w:pPr>
+      <w:r>
+        <w:rPr>
+          <w:rStyle w:val="translatable-message"/>
+          <w:rFonts w:ascii="Times New Roman" w:hAnsi="Times New Roman" w:cs="Times New Roman"/>
+          <w:b/>
+          <w:sz w:val="28"/>
+          <w:szCs w:val="28"/>
+        </w:rPr>
+        <w:t xml:space="preserve">2. Текущие задачи и проблемы </w:t>
+      </w:r>
+      <w:r>
+        <w:rPr>
+          <w:rStyle w:val="translatable-message"/>
+          <w:rFonts w:ascii="Times New Roman" w:hAnsi="Times New Roman" w:cs="Times New Roman"/>
+          <w:b/>
+          <w:sz w:val="28"/>
+          <w:szCs w:val="28"/>
+        </w:rPr>
+        <w:t>в работе:</w:t>
+      </w:r>
+    </w:p>
+    <w:p>
+      <w:pPr>
+        <w:spacing w:line="240" w:lineRule="auto"/>
+        <w:rPr>
+          <w:rStyle w:val="translatable-message"/>
+          <w:rFonts w:ascii="Times New Roman" w:hAnsi="Times New Roman" w:cs="Times New Roman"/>
+          <w:sz w:val="28"/>
+          <w:szCs w:val="28"/>
+        </w:rPr>
+      </w:pPr>
+      <w:r>
+        <w:rPr>
+          <w:rStyle w:val="translatable-message"/>
+          <w:rFonts w:ascii="Times New Roman" w:hAnsi="Times New Roman" w:cs="Times New Roman"/>
+          <w:sz w:val="28"/>
+          <w:szCs w:val="28"/>
+        </w:rPr>
+        <w:t>Задачи</w:t>
+      </w:r>
+      <w:r>
+        <w:rPr>
+          <w:rStyle w:val="translatable-message"/>
+          <w:rFonts w:ascii="Times New Roman" w:hAnsi="Times New Roman" w:cs="Times New Roman"/>
+          <w:sz w:val="28"/>
+          <w:szCs w:val="28"/>
+        </w:rPr>
+        <w:t>:</w:t>
+      </w:r>
+    </w:p>
+    <w:p>
+      <w:pPr>
+        <w:spacing w:line="240" w:lineRule="auto"/>
+        <w:rPr>
+          <w:rStyle w:val="translatable-message"/>
+          <w:rFonts w:ascii="Times New Roman" w:hAnsi="Times New Roman" w:cs="Times New Roman"/>
+          <w:sz w:val="28"/>
+          <w:szCs w:val="28"/>
+        </w:rPr>
+      </w:pPr>
+      <w:r>
+        <w:rPr>
+          <w:rStyle w:val="translatable-message"/>
+          <w:rFonts w:ascii="Times New Roman" w:hAnsi="Times New Roman" w:cs="Times New Roman"/>
+          <w:sz w:val="28"/>
+          <w:szCs w:val="28"/>
+        </w:rPr>
+        <w:t>-</w:t>
+      </w:r>
+      <w:r>
+        <w:t xml:space="preserve"> </w:t>
+      </w:r>
+      <w:r>
+        <w:rPr>
+          <w:rStyle w:val="translatable-message"/>
+          <w:rFonts w:ascii="Times New Roman" w:hAnsi="Times New Roman" w:cs="Times New Roman"/>
+          <w:sz w:val="28"/>
+          <w:szCs w:val="28"/>
+        </w:rPr>
+        <w:t>Реализова</w:t>
+      </w:r>
+      <w:r>
+        <w:rPr>
+          <w:rStyle w:val="translatable-message"/>
+          <w:rFonts w:ascii="Times New Roman" w:hAnsi="Times New Roman" w:cs="Times New Roman"/>
+          <w:sz w:val="28"/>
+          <w:szCs w:val="28"/>
+        </w:rPr>
+        <w:t>ть</w:t>
+      </w:r>
+      <w:r>
+        <w:rPr>
+          <w:rStyle w:val="translatable-message"/>
+          <w:rFonts w:ascii="Times New Roman" w:hAnsi="Times New Roman" w:cs="Times New Roman"/>
+          <w:sz w:val="28"/>
+          <w:szCs w:val="28"/>
+        </w:rPr>
+        <w:t xml:space="preserve"> основной пользовательский сценарий</w:t>
+      </w:r>
+      <w:r>
+        <w:rPr>
+          <w:rStyle w:val="translatable-message"/>
+          <w:rFonts w:ascii="Times New Roman" w:hAnsi="Times New Roman" w:cs="Times New Roman"/>
+          <w:sz w:val="28"/>
+          <w:szCs w:val="28"/>
+        </w:rPr>
+        <w:t xml:space="preserve"> (генерация обложки по аудио-файлу</w:t>
+      </w:r>
+      <w:proofErr w:type="gramStart"/>
+      <w:r>
+        <w:rPr>
+          <w:rStyle w:val="translatable-message"/>
+          <w:rFonts w:ascii="Times New Roman" w:hAnsi="Times New Roman" w:cs="Times New Roman"/>
+          <w:sz w:val="28"/>
+          <w:szCs w:val="28"/>
+        </w:rPr>
+        <w:t>)</w:t>
+      </w:r>
+      <w:r>
+        <w:rPr>
+          <w:rStyle w:val="translatable-message"/>
+          <w:rFonts w:ascii="Times New Roman" w:hAnsi="Times New Roman" w:cs="Times New Roman"/>
+          <w:sz w:val="28"/>
+          <w:szCs w:val="28"/>
+        </w:rPr>
+        <w:t>;</w:t>
+      </w:r>
+      <w:r>
+        <w:rPr>
+          <w:rStyle w:val="translatable-message"/>
+          <w:rFonts w:ascii="Times New Roman" w:hAnsi="Times New Roman" w:cs="Times New Roman"/>
+          <w:sz w:val="28"/>
+          <w:szCs w:val="28"/>
+        </w:rPr>
+        <w:br/>
+        <w:t>-</w:t>
+      </w:r>
+      <w:proofErr w:type="gramEnd"/>
+      <w:r>
+        <w:rPr>
+          <w:rStyle w:val="translatable-message"/>
+          <w:rFonts w:ascii="Times New Roman" w:hAnsi="Times New Roman" w:cs="Times New Roman"/>
+          <w:sz w:val="28"/>
+          <w:szCs w:val="28"/>
+        </w:rPr>
+        <w:t xml:space="preserve"> Реализовать редактор изображений;</w:t>
+      </w:r>
+      <w:r>
+        <w:rPr>
+          <w:rStyle w:val="translatable-message"/>
+          <w:rFonts w:ascii="Times New Roman" w:hAnsi="Times New Roman" w:cs="Times New Roman"/>
+          <w:sz w:val="28"/>
+          <w:szCs w:val="28"/>
+        </w:rPr>
+        <w:br/>
+        <w:t>- Покрыть основные компоненты авторизации, регистрации и генерации юнит-тестами в соответствии с тест кейсами;</w:t>
+      </w:r>
+      <w:r>
+        <w:rPr>
+          <w:rStyle w:val="translatable-message"/>
+          <w:rFonts w:ascii="Times New Roman" w:hAnsi="Times New Roman" w:cs="Times New Roman"/>
+          <w:sz w:val="28"/>
+          <w:szCs w:val="28"/>
+        </w:rPr>
+        <w:br/>
+        <w:t>- Связать админ панель с базой данных;</w:t>
+      </w:r>
+      <w:r>
+        <w:rPr>
+          <w:rStyle w:val="translatable-message"/>
+          <w:rFonts w:ascii="Times New Roman" w:hAnsi="Times New Roman" w:cs="Times New Roman"/>
+          <w:sz w:val="28"/>
+          <w:szCs w:val="28"/>
+        </w:rPr>
+        <w:br/>
+        <w:t>- Подготовить документ курсовой работы.</w:t>
+      </w:r>
+    </w:p>
+    <w:p>
+      <w:pPr>
+        <w:spacing w:line="240" w:lineRule="auto"/>
+        <w:rPr>
+          <w:rStyle w:val="translatable-message"/>
+          <w:rFonts w:ascii="Times New Roman" w:hAnsi="Times New Roman" w:cs="Times New Roman"/>
+          <w:sz w:val="28"/>
+          <w:szCs w:val="28"/>
+        </w:rPr>
+      </w:pPr>
+      <w:r>
+        <w:rPr>
+          <w:rStyle w:val="translatable-message"/>
+          <w:rFonts w:ascii="Times New Roman" w:hAnsi="Times New Roman" w:cs="Times New Roman"/>
+          <w:sz w:val="28"/>
+          <w:szCs w:val="28"/>
+        </w:rPr>
+        <w:t>Проблемы</w:t>
+      </w:r>
+      <w:r>
+        <w:rPr>
+          <w:rStyle w:val="translatable-message"/>
+          <w:rFonts w:ascii="Times New Roman" w:hAnsi="Times New Roman" w:cs="Times New Roman"/>
+          <w:sz w:val="28"/>
+          <w:szCs w:val="28"/>
+        </w:rPr>
+        <w:t>:</w:t>
+      </w:r>
+    </w:p>
+    <w:p>
+      <w:pPr>
+        <w:spacing w:line="240" w:lineRule="auto"/>
+        <w:rPr>
+          <w:rStyle w:val="translatable-message"/>
+          <w:rFonts w:ascii="Times New Roman" w:hAnsi="Times New Roman" w:cs="Times New Roman"/>
+          <w:sz w:val="28"/>
+          <w:szCs w:val="28"/>
+        </w:rPr>
+      </w:pPr>
+      <w:r>
+        <w:rPr>
+          <w:rStyle w:val="translatable-message"/>
+          <w:rFonts w:ascii="Times New Roman" w:hAnsi="Times New Roman" w:cs="Times New Roman"/>
+          <w:sz w:val="28"/>
+          <w:szCs w:val="28"/>
+        </w:rPr>
+        <w:t xml:space="preserve">- </w:t>
+      </w:r>
+      <w:r>
+        <w:rPr>
+          <w:rStyle w:val="translatable-message"/>
+          <w:rFonts w:ascii="Times New Roman" w:hAnsi="Times New Roman" w:cs="Times New Roman"/>
+          <w:sz w:val="28"/>
+          <w:szCs w:val="28"/>
+        </w:rPr>
+        <w:t>Из-за отсутствия реализованных пользовательских сценариев невозможно начать работу по внедрению аналитики в приложение.</w:t>
+      </w:r>
+      <w:r>
+        <w:rPr>
+          <w:rStyle w:val="translatable-message"/>
+          <w:rFonts w:ascii="Times New Roman" w:hAnsi="Times New Roman" w:cs="Times New Roman"/>
+          <w:sz w:val="28"/>
+          <w:szCs w:val="28"/>
+        </w:rPr>
+        <w:t xml:space="preserve"> Аналитика будет добавляться после привязки реализованног</w:t>
+      </w:r>
+      <w:r>
+        <w:rPr>
+          <w:rStyle w:val="translatable-message"/>
+          <w:rFonts w:ascii="Times New Roman" w:hAnsi="Times New Roman" w:cs="Times New Roman"/>
+          <w:sz w:val="28"/>
+          <w:szCs w:val="28"/>
+        </w:rPr>
+        <w:t xml:space="preserve">о </w:t>
+      </w:r>
+      <w:proofErr w:type="spellStart"/>
+      <w:r>
+        <w:rPr>
+          <w:rStyle w:val="translatable-message"/>
+          <w:rFonts w:ascii="Times New Roman" w:hAnsi="Times New Roman" w:cs="Times New Roman"/>
+          <w:sz w:val="28"/>
+          <w:szCs w:val="28"/>
+        </w:rPr>
+        <w:t>бэкэнда</w:t>
+      </w:r>
+      <w:proofErr w:type="spellEnd"/>
+      <w:r>
+        <w:rPr>
+          <w:rStyle w:val="translatable-message"/>
+          <w:rFonts w:ascii="Times New Roman" w:hAnsi="Times New Roman" w:cs="Times New Roman"/>
+          <w:sz w:val="28"/>
+          <w:szCs w:val="28"/>
+        </w:rPr>
+        <w:t xml:space="preserve"> к </w:t>
+      </w:r>
+      <w:proofErr w:type="spellStart"/>
+      <w:r>
+        <w:rPr>
+          <w:rStyle w:val="translatable-message"/>
+          <w:rFonts w:ascii="Times New Roman" w:hAnsi="Times New Roman" w:cs="Times New Roman"/>
+          <w:sz w:val="28"/>
+          <w:szCs w:val="28"/>
+        </w:rPr>
+        <w:t>андроид</w:t>
+      </w:r>
+      <w:proofErr w:type="spellEnd"/>
+      <w:r>
+        <w:rPr>
+          <w:rStyle w:val="translatable-message"/>
+          <w:rFonts w:ascii="Times New Roman" w:hAnsi="Times New Roman" w:cs="Times New Roman"/>
+          <w:sz w:val="28"/>
+          <w:szCs w:val="28"/>
+        </w:rPr>
+        <w:t xml:space="preserve"> </w:t>
+      </w:r>
+      <w:proofErr w:type="gramStart"/>
+      <w:r>
+        <w:rPr>
+          <w:rStyle w:val="translatable-message"/>
+          <w:rFonts w:ascii="Times New Roman" w:hAnsi="Times New Roman" w:cs="Times New Roman"/>
+          <w:sz w:val="28"/>
+          <w:szCs w:val="28"/>
+        </w:rPr>
+        <w:t>приложению.</w:t>
+      </w:r>
+      <w:r>
+        <w:rPr>
+          <w:rStyle w:val="translatable-message"/>
+          <w:rFonts w:ascii="Times New Roman" w:hAnsi="Times New Roman" w:cs="Times New Roman"/>
+          <w:sz w:val="28"/>
+          <w:szCs w:val="28"/>
+        </w:rPr>
+        <w:br/>
+        <w:t>-</w:t>
+      </w:r>
+      <w:proofErr w:type="gramEnd"/>
+      <w:r>
+        <w:rPr>
+          <w:rStyle w:val="translatable-message"/>
+          <w:rFonts w:ascii="Times New Roman" w:hAnsi="Times New Roman" w:cs="Times New Roman"/>
+          <w:sz w:val="28"/>
+          <w:szCs w:val="28"/>
+        </w:rPr>
+        <w:t xml:space="preserve"> </w:t>
+      </w:r>
+      <w:r>
+        <w:rPr>
+          <w:rStyle w:val="translatable-message"/>
+          <w:rFonts w:ascii="Times New Roman" w:hAnsi="Times New Roman" w:cs="Times New Roman"/>
+          <w:sz w:val="28"/>
+          <w:szCs w:val="28"/>
+        </w:rPr>
+        <w:t xml:space="preserve">Записи о </w:t>
+      </w:r>
+      <w:proofErr w:type="spellStart"/>
+      <w:r>
+        <w:rPr>
+          <w:rStyle w:val="translatable-message"/>
+          <w:rFonts w:ascii="Times New Roman" w:hAnsi="Times New Roman" w:cs="Times New Roman"/>
+          <w:sz w:val="28"/>
+          <w:szCs w:val="28"/>
+        </w:rPr>
+        <w:t>субдоменах</w:t>
+      </w:r>
+      <w:proofErr w:type="spellEnd"/>
+      <w:r>
+        <w:rPr>
+          <w:rStyle w:val="translatable-message"/>
+          <w:rFonts w:ascii="Times New Roman" w:hAnsi="Times New Roman" w:cs="Times New Roman"/>
+          <w:sz w:val="28"/>
+          <w:szCs w:val="28"/>
+        </w:rPr>
+        <w:t xml:space="preserve"> не обновляются на DNS-серверах, поэтому нет возможности использовать их</w:t>
+      </w:r>
+      <w:r>
+        <w:rPr>
+          <w:rStyle w:val="translatable-message"/>
+          <w:rFonts w:ascii="Times New Roman" w:hAnsi="Times New Roman" w:cs="Times New Roman"/>
+          <w:sz w:val="28"/>
+          <w:szCs w:val="28"/>
+        </w:rPr>
+        <w:t xml:space="preserve">. </w:t>
+      </w:r>
+      <w:r>
+        <w:rPr>
+          <w:rStyle w:val="translatable-message"/>
+          <w:rFonts w:ascii="Times New Roman" w:hAnsi="Times New Roman" w:cs="Times New Roman"/>
+          <w:sz w:val="28"/>
+          <w:szCs w:val="28"/>
+        </w:rPr>
+        <w:t>Однако домен есть</w:t>
+      </w:r>
+      <w:r>
+        <w:rPr>
+          <w:rStyle w:val="translatable-message"/>
+          <w:rFonts w:ascii="Times New Roman" w:hAnsi="Times New Roman" w:cs="Times New Roman"/>
+          <w:sz w:val="28"/>
+          <w:szCs w:val="28"/>
+        </w:rPr>
+        <w:t xml:space="preserve"> и мы пока ждем его обновления.</w:t>
+      </w:r>
       <w:bookmarkStart w:id="0" w:name="_GoBack"/>
       <w:bookmarkEnd w:id="0"/>
     </w:p>
@@ -716,17 +1107,7 @@
           <w:sz w:val="28"/>
           <w:szCs w:val="28"/>
         </w:rPr>
-        <w:t xml:space="preserve">2. Текущие задачи и проблемы </w:t>
-      </w:r>
-      <w:r>
-        <w:rPr>
-          <w:rStyle w:val="translatable-message"/>
-          <w:rFonts w:ascii="Times New Roman" w:hAnsi="Times New Roman" w:cs="Times New Roman"/>
-          <w:b/>
-          <w:sz w:val="28"/>
-          <w:szCs w:val="28"/>
-        </w:rPr>
-        <w:t>в работе:</w:t>
+        <w:t>3. План на следующую неделю</w:t>
       </w:r>
     </w:p>
     <w:p>
@@ -746,16 +1127,7 @@
           <w:sz w:val="28"/>
           <w:szCs w:val="28"/>
         </w:rPr>
-        <w:t>Задачи</w:t>
-      </w:r>
-      <w:r>
-        <w:rPr>
-          <w:rStyle w:val="translatable-message"/>
-          <w:rFonts w:ascii="Times New Roman" w:hAnsi="Times New Roman" w:cs="Times New Roman"/>
-          <w:sz w:val="28"/>
-          <w:szCs w:val="28"/>
-        </w:rPr>
-        <w:t>:</w:t>
+        <w:t>Приоритеты:</w:t>
       </w:r>
     </w:p>
     <w:p>
@@ -775,65 +1147,100 @@
           <w:sz w:val="28"/>
           <w:szCs w:val="28"/>
         </w:rPr>
+        <w:t xml:space="preserve">- </w:t>
+      </w:r>
+      <w:r>
+        <w:rPr>
+          <w:rStyle w:val="translatable-message"/>
+          <w:rFonts w:ascii="Times New Roman" w:hAnsi="Times New Roman" w:cs="Times New Roman"/>
+          <w:sz w:val="28"/>
+          <w:szCs w:val="28"/>
+        </w:rPr>
+        <w:t xml:space="preserve">Реализовать </w:t>
+      </w:r>
+      <w:r>
+        <w:rPr>
+          <w:rStyle w:val="translatable-message"/>
+          <w:rFonts w:ascii="Times New Roman" w:hAnsi="Times New Roman" w:cs="Times New Roman"/>
+          <w:sz w:val="28"/>
+          <w:szCs w:val="28"/>
+        </w:rPr>
+        <w:t>пользовательский сценарий «Генерация»;</w:t>
+      </w:r>
+      <w:r>
+        <w:rPr>
+          <w:rStyle w:val="translatable-message"/>
+          <w:rFonts w:ascii="Times New Roman" w:hAnsi="Times New Roman" w:cs="Times New Roman"/>
+          <w:sz w:val="28"/>
+          <w:szCs w:val="28"/>
+        </w:rPr>
+        <w:t xml:space="preserve"> </w:t>
+      </w:r>
+      <w:r>
+        <w:rPr>
+          <w:rStyle w:val="translatable-message"/>
+          <w:rFonts w:ascii="Times New Roman" w:hAnsi="Times New Roman" w:cs="Times New Roman"/>
+          <w:sz w:val="28"/>
+          <w:szCs w:val="28"/>
+        </w:rPr>
+        <w:br/>
+        <w:t xml:space="preserve">- </w:t>
+      </w:r>
+      <w:r>
+        <w:rPr>
+          <w:rStyle w:val="translatable-message"/>
+          <w:rFonts w:ascii="Times New Roman" w:hAnsi="Times New Roman" w:cs="Times New Roman"/>
+          <w:sz w:val="28"/>
+          <w:szCs w:val="28"/>
+        </w:rPr>
+        <w:t xml:space="preserve">Доделать админ </w:t>
+      </w:r>
+      <w:proofErr w:type="gramStart"/>
+      <w:r>
+        <w:rPr>
+          <w:rStyle w:val="translatable-message"/>
+          <w:rFonts w:ascii="Times New Roman" w:hAnsi="Times New Roman" w:cs="Times New Roman"/>
+          <w:sz w:val="28"/>
+          <w:szCs w:val="28"/>
+        </w:rPr>
+        <w:t>панель</w:t>
+      </w:r>
+      <w:r>
+        <w:rPr>
+          <w:rStyle w:val="translatable-message"/>
+          <w:rFonts w:ascii="Times New Roman" w:hAnsi="Times New Roman" w:cs="Times New Roman"/>
+          <w:sz w:val="28"/>
+          <w:szCs w:val="28"/>
+        </w:rPr>
+        <w:t>;</w:t>
+      </w:r>
+      <w:r>
+        <w:rPr>
+          <w:rStyle w:val="translatable-message"/>
+          <w:rFonts w:ascii="Times New Roman" w:hAnsi="Times New Roman" w:cs="Times New Roman"/>
+          <w:sz w:val="28"/>
+          <w:szCs w:val="28"/>
+        </w:rPr>
+        <w:br/>
+      </w:r>
+      <w:r>
+        <w:rPr>
+          <w:rStyle w:val="translatable-message"/>
+          <w:rFonts w:ascii="Times New Roman" w:hAnsi="Times New Roman" w:cs="Times New Roman"/>
+          <w:sz w:val="28"/>
+          <w:szCs w:val="28"/>
+        </w:rPr>
         <w:t>-</w:t>
       </w:r>
-      <w:r>
-        <w:t xml:space="preserve"> </w:t>
-      </w:r>
-      <w:r>
-        <w:rPr>
-          <w:rStyle w:val="translatable-message"/>
-          <w:rFonts w:ascii="Times New Roman" w:hAnsi="Times New Roman" w:cs="Times New Roman"/>
-          <w:sz w:val="28"/>
-          <w:szCs w:val="28"/>
-        </w:rPr>
-        <w:t>Реализова</w:t>
-      </w:r>
-      <w:r>
-        <w:rPr>
-          <w:rStyle w:val="translatable-message"/>
-          <w:rFonts w:ascii="Times New Roman" w:hAnsi="Times New Roman" w:cs="Times New Roman"/>
-          <w:sz w:val="28"/>
-          <w:szCs w:val="28"/>
-        </w:rPr>
-        <w:t>ть</w:t>
-      </w:r>
-      <w:r>
-        <w:rPr>
-          <w:rStyle w:val="translatable-message"/>
-          <w:rFonts w:ascii="Times New Roman" w:hAnsi="Times New Roman" w:cs="Times New Roman"/>
-          <w:sz w:val="28"/>
-          <w:szCs w:val="28"/>
-        </w:rPr>
-        <w:t xml:space="preserve"> основной пользовательский сценарий</w:t>
-      </w:r>
-      <w:r>
-        <w:rPr>
-          <w:rStyle w:val="translatable-message"/>
-          <w:rFonts w:ascii="Times New Roman" w:hAnsi="Times New Roman" w:cs="Times New Roman"/>
-          <w:sz w:val="28"/>
-          <w:szCs w:val="28"/>
-        </w:rPr>
-        <w:t xml:space="preserve"> (генерация обложки по аудио-файлу</w:t>
-      </w:r>
-      <w:proofErr w:type="gramStart"/>
-      <w:r>
-        <w:rPr>
-          <w:rStyle w:val="translatable-message"/>
-          <w:rFonts w:ascii="Times New Roman" w:hAnsi="Times New Roman" w:cs="Times New Roman"/>
-          <w:sz w:val="28"/>
-          <w:szCs w:val="28"/>
-        </w:rPr>
-        <w:t>)</w:t>
-      </w:r>
-      <w:r>
-        <w:rPr>
-          <w:rStyle w:val="translatable-message"/>
-          <w:rFonts w:ascii="Times New Roman" w:hAnsi="Times New Roman" w:cs="Times New Roman"/>
-          <w:sz w:val="28"/>
-          <w:szCs w:val="28"/>
-        </w:rPr>
-        <w:t>;</w:t>
+      <w:proofErr w:type="gramEnd"/>
+      <w:r>
+        <w:rPr>
+          <w:rStyle w:val="translatable-message"/>
+          <w:rFonts w:ascii="Times New Roman" w:hAnsi="Times New Roman" w:cs="Times New Roman"/>
+          <w:sz w:val="28"/>
+          <w:szCs w:val="28"/>
+        </w:rPr>
+        <w:t xml:space="preserve"> Покрыть юнит-тестами экраны регистрации и аутентификации;</w:t>
       </w:r>
       <w:r>
         <w:rPr>
@@ -843,47 +1250,25 @@
           <w:szCs w:val="28"/>
         </w:rPr>
         <w:br/>
-        <w:t>-</w:t>
-      </w:r>
-      <w:proofErr w:type="gramEnd"/>
-      <w:r>
-        <w:rPr>
-          <w:rStyle w:val="translatable-message"/>
-          <w:rFonts w:ascii="Times New Roman" w:hAnsi="Times New Roman" w:cs="Times New Roman"/>
-          <w:sz w:val="28"/>
-          <w:szCs w:val="28"/>
-        </w:rPr>
-        <w:t xml:space="preserve"> Реализовать редактор изображений;</w:t>
-      </w:r>
-      <w:r>
-        <w:rPr>
-          <w:rStyle w:val="translatable-message"/>
-          <w:rFonts w:ascii="Times New Roman" w:hAnsi="Times New Roman" w:cs="Times New Roman"/>
-          <w:sz w:val="28"/>
-          <w:szCs w:val="28"/>
-        </w:rPr>
-        <w:br/>
-        <w:t>- Покрыть основные компоненты авторизации, регистрации и генерации юнит-тестами в соответствии с тест кейсами;</w:t>
-      </w:r>
-      <w:r>
-        <w:rPr>
-          <w:rStyle w:val="translatable-message"/>
-          <w:rFonts w:ascii="Times New Roman" w:hAnsi="Times New Roman" w:cs="Times New Roman"/>
-          <w:sz w:val="28"/>
-          <w:szCs w:val="28"/>
-        </w:rPr>
-        <w:br/>
-        <w:t>- Связать админ панель с базой данных;</w:t>
-      </w:r>
-      <w:r>
-        <w:rPr>
-          <w:rStyle w:val="translatable-message"/>
-          <w:rFonts w:ascii="Times New Roman" w:hAnsi="Times New Roman" w:cs="Times New Roman"/>
-          <w:sz w:val="28"/>
-          <w:szCs w:val="28"/>
-        </w:rPr>
-        <w:br/>
-        <w:t>- Подготовить документ курсовой работы.</w:t>
+        <w:t>- Связать админ панель с базой данных</w:t>
+      </w:r>
+      <w:r>
+        <w:rPr>
+          <w:rStyle w:val="translatable-message"/>
+          <w:rFonts w:ascii="Times New Roman" w:hAnsi="Times New Roman" w:cs="Times New Roman"/>
+          <w:sz w:val="28"/>
+          <w:szCs w:val="28"/>
+        </w:rPr>
+        <w:t xml:space="preserve"> пользователей</w:t>
+      </w:r>
+      <w:r>
+        <w:rPr>
+          <w:rStyle w:val="translatable-message"/>
+          <w:rFonts w:ascii="Times New Roman" w:hAnsi="Times New Roman" w:cs="Times New Roman"/>
+          <w:sz w:val="28"/>
+          <w:szCs w:val="28"/>
+        </w:rPr>
+        <w:t>.</w:t>
       </w:r>
     </w:p>
     <w:p>
@@ -900,19 +1285,11 @@
         <w:rPr>
           <w:rStyle w:val="translatable-message"/>
           <w:rFonts w:ascii="Times New Roman" w:hAnsi="Times New Roman" w:cs="Times New Roman"/>
-          <w:sz w:val="28"/>
-          <w:szCs w:val="28"/>
-        </w:rPr>
-        <w:t>Проблемы</w:t>
-      </w:r>
-      <w:r>
-        <w:rPr>
-          <w:rStyle w:val="translatable-message"/>
-          <w:rFonts w:ascii="Times New Roman" w:hAnsi="Times New Roman" w:cs="Times New Roman"/>
-          <w:sz w:val="28"/>
-          <w:szCs w:val="28"/>
-        </w:rPr>
-        <w:t>:</w:t>
+          <w:b/>
+          <w:sz w:val="28"/>
+          <w:szCs w:val="28"/>
+        </w:rPr>
+        <w:t>Метрики контроля</w:t>
       </w:r>
     </w:p>
     <w:p>
@@ -932,6 +1309,7 @@
           <w:sz w:val="28"/>
           <w:szCs w:val="28"/>
         </w:rPr>
+        <w:lastRenderedPageBreak/>
         <w:t xml:space="preserve">- </w:t>
       </w:r>
       <w:r>
@@ -941,136 +1319,16 @@
           <w:sz w:val="28"/>
           <w:szCs w:val="28"/>
         </w:rPr>
-        <w:t>Из-за отсутствия реализованных пользовательских сценариев невозможно начать работу по внедрению аналитики в приложение.</w:t>
-      </w:r>
-      <w:r>
-        <w:rPr>
-          <w:rStyle w:val="translatable-message"/>
-          <w:rFonts w:ascii="Times New Roman" w:hAnsi="Times New Roman" w:cs="Times New Roman"/>
-          <w:sz w:val="28"/>
-          <w:szCs w:val="28"/>
-        </w:rPr>
-        <w:t xml:space="preserve"> Аналитика будет добавляться после привязки реализованного </w:t>
-      </w:r>
-      <w:proofErr w:type="spellStart"/>
-      <w:r>
-        <w:rPr>
-          <w:rStyle w:val="translatable-message"/>
-          <w:rFonts w:ascii="Times New Roman" w:hAnsi="Times New Roman" w:cs="Times New Roman"/>
-          <w:sz w:val="28"/>
-          <w:szCs w:val="28"/>
-        </w:rPr>
-        <w:t>бэкэнда</w:t>
-      </w:r>
-      <w:proofErr w:type="spellEnd"/>
-      <w:r>
-        <w:rPr>
-          <w:rStyle w:val="translatable-message"/>
-          <w:rFonts w:ascii="Times New Roman" w:hAnsi="Times New Roman" w:cs="Times New Roman"/>
-          <w:sz w:val="28"/>
-          <w:szCs w:val="28"/>
-        </w:rPr>
-        <w:t xml:space="preserve"> к </w:t>
-      </w:r>
-      <w:proofErr w:type="spellStart"/>
-      <w:r>
-        <w:rPr>
-          <w:rStyle w:val="translatable-message"/>
-          <w:rFonts w:ascii="Times New Roman" w:hAnsi="Times New Roman" w:cs="Times New Roman"/>
-          <w:sz w:val="28"/>
-          <w:szCs w:val="28"/>
-        </w:rPr>
-        <w:t>андроид</w:t>
-      </w:r>
-      <w:proofErr w:type="spellEnd"/>
-      <w:r>
-        <w:rPr>
-          <w:rStyle w:val="translatable-message"/>
-          <w:rFonts w:ascii="Times New Roman" w:hAnsi="Times New Roman" w:cs="Times New Roman"/>
-          <w:sz w:val="28"/>
-          <w:szCs w:val="28"/>
-        </w:rPr>
-        <w:t xml:space="preserve"> приложению. </w:t>
-      </w:r>
-    </w:p>
-    <w:p>
-      <w:pPr>
-        <w:spacing w:line="240" w:lineRule="auto"/>
-        <w:rPr>
-          <w:rStyle w:val="translatable-message"/>
-          <w:rFonts w:ascii="Times New Roman" w:hAnsi="Times New Roman" w:cs="Times New Roman"/>
-          <w:b/>
-          <w:sz w:val="28"/>
-          <w:szCs w:val="28"/>
-        </w:rPr>
-      </w:pPr>
-      <w:r>
-        <w:rPr>
-          <w:rStyle w:val="translatable-message"/>
-          <w:rFonts w:ascii="Times New Roman" w:hAnsi="Times New Roman" w:cs="Times New Roman"/>
-          <w:b/>
-          <w:sz w:val="28"/>
-          <w:szCs w:val="28"/>
-        </w:rPr>
-        <w:t>3. План на следующую неделю</w:t>
-      </w:r>
-    </w:p>
-    <w:p>
-      <w:pPr>
-        <w:spacing w:line="240" w:lineRule="auto"/>
-        <w:rPr>
-          <w:rStyle w:val="translatable-message"/>
-          <w:rFonts w:ascii="Times New Roman" w:hAnsi="Times New Roman" w:cs="Times New Roman"/>
-          <w:sz w:val="28"/>
-          <w:szCs w:val="28"/>
-        </w:rPr>
-      </w:pPr>
-      <w:r>
-        <w:rPr>
-          <w:rStyle w:val="translatable-message"/>
-          <w:rFonts w:ascii="Times New Roman" w:hAnsi="Times New Roman" w:cs="Times New Roman"/>
-          <w:sz w:val="28"/>
-          <w:szCs w:val="28"/>
-        </w:rPr>
-        <w:t>Приоритеты:</w:t>
-      </w:r>
-    </w:p>
-    <w:p>
-      <w:pPr>
-        <w:spacing w:line="240" w:lineRule="auto"/>
-        <w:rPr>
-          <w:rStyle w:val="translatable-message"/>
-          <w:rFonts w:ascii="Times New Roman" w:hAnsi="Times New Roman" w:cs="Times New Roman"/>
-          <w:sz w:val="28"/>
-          <w:szCs w:val="28"/>
-        </w:rPr>
-      </w:pPr>
-      <w:r>
-        <w:rPr>
-          <w:rStyle w:val="translatable-message"/>
-          <w:rFonts w:ascii="Times New Roman" w:hAnsi="Times New Roman" w:cs="Times New Roman"/>
-          <w:sz w:val="28"/>
-          <w:szCs w:val="28"/>
-        </w:rPr>
-        <w:t xml:space="preserve">- </w:t>
-      </w:r>
-      <w:r>
-        <w:rPr>
-          <w:rStyle w:val="translatable-message"/>
-          <w:rFonts w:ascii="Times New Roman" w:hAnsi="Times New Roman" w:cs="Times New Roman"/>
-          <w:sz w:val="28"/>
-          <w:szCs w:val="28"/>
-        </w:rPr>
-        <w:t xml:space="preserve">Реализовать </w:t>
-      </w:r>
-      <w:r>
-        <w:rPr>
-          <w:rStyle w:val="translatable-message"/>
-          <w:rFonts w:ascii="Times New Roman" w:hAnsi="Times New Roman" w:cs="Times New Roman"/>
-          <w:sz w:val="28"/>
-          <w:szCs w:val="28"/>
-        </w:rPr>
-        <w:t>пользовательский сценарий «Генерация»;</w:t>
+        <w:t>Создание рабоч</w:t>
+      </w:r>
+      <w:r>
+        <w:rPr>
+          <w:rStyle w:val="translatable-message"/>
+          <w:rFonts w:ascii="Times New Roman" w:hAnsi="Times New Roman" w:cs="Times New Roman"/>
+          <w:sz w:val="28"/>
+          <w:szCs w:val="28"/>
+        </w:rPr>
+        <w:t>их</w:t>
       </w:r>
       <w:r>
         <w:rPr>
@@ -1088,168 +1346,6 @@
           <w:sz w:val="28"/>
           <w:szCs w:val="28"/>
         </w:rPr>
-        <w:br/>
-        <w:t xml:space="preserve">- </w:t>
-      </w:r>
-      <w:r>
-        <w:rPr>
-          <w:rStyle w:val="translatable-message"/>
-          <w:rFonts w:ascii="Times New Roman" w:hAnsi="Times New Roman" w:cs="Times New Roman"/>
-          <w:sz w:val="28"/>
-          <w:szCs w:val="28"/>
-        </w:rPr>
-        <w:t xml:space="preserve">Доделать админ </w:t>
-      </w:r>
-      <w:proofErr w:type="gramStart"/>
-      <w:r>
-        <w:rPr>
-          <w:rStyle w:val="translatable-message"/>
-          <w:rFonts w:ascii="Times New Roman" w:hAnsi="Times New Roman" w:cs="Times New Roman"/>
-          <w:sz w:val="28"/>
-          <w:szCs w:val="28"/>
-        </w:rPr>
-        <w:t>панель</w:t>
-      </w:r>
-      <w:r>
-        <w:rPr>
-          <w:rStyle w:val="translatable-message"/>
-          <w:rFonts w:ascii="Times New Roman" w:hAnsi="Times New Roman" w:cs="Times New Roman"/>
-          <w:sz w:val="28"/>
-          <w:szCs w:val="28"/>
-        </w:rPr>
-        <w:t>;</w:t>
-      </w:r>
-      <w:r>
-        <w:rPr>
-          <w:rStyle w:val="translatable-message"/>
-          <w:rFonts w:ascii="Times New Roman" w:hAnsi="Times New Roman" w:cs="Times New Roman"/>
-          <w:sz w:val="28"/>
-          <w:szCs w:val="28"/>
-        </w:rPr>
-        <w:br/>
-      </w:r>
-      <w:r>
-        <w:rPr>
-          <w:rStyle w:val="translatable-message"/>
-          <w:rFonts w:ascii="Times New Roman" w:hAnsi="Times New Roman" w:cs="Times New Roman"/>
-          <w:sz w:val="28"/>
-          <w:szCs w:val="28"/>
-        </w:rPr>
-        <w:t>-</w:t>
-      </w:r>
-      <w:proofErr w:type="gramEnd"/>
-      <w:r>
-        <w:rPr>
-          <w:rStyle w:val="translatable-message"/>
-          <w:rFonts w:ascii="Times New Roman" w:hAnsi="Times New Roman" w:cs="Times New Roman"/>
-          <w:sz w:val="28"/>
-          <w:szCs w:val="28"/>
-        </w:rPr>
-        <w:t xml:space="preserve"> Покрыть юнит-тестами экраны регистрации и аутентификации;</w:t>
-      </w:r>
-      <w:r>
-        <w:rPr>
-          <w:rStyle w:val="translatable-message"/>
-          <w:rFonts w:ascii="Times New Roman" w:hAnsi="Times New Roman" w:cs="Times New Roman"/>
-          <w:sz w:val="28"/>
-          <w:szCs w:val="28"/>
-        </w:rPr>
-        <w:br/>
-        <w:t>- Связать админ панель с базой данных</w:t>
-      </w:r>
-      <w:r>
-        <w:rPr>
-          <w:rStyle w:val="translatable-message"/>
-          <w:rFonts w:ascii="Times New Roman" w:hAnsi="Times New Roman" w:cs="Times New Roman"/>
-          <w:sz w:val="28"/>
-          <w:szCs w:val="28"/>
-        </w:rPr>
-        <w:t xml:space="preserve"> пользователей</w:t>
-      </w:r>
-      <w:r>
-        <w:rPr>
-          <w:rStyle w:val="translatable-message"/>
-          <w:rFonts w:ascii="Times New Roman" w:hAnsi="Times New Roman" w:cs="Times New Roman"/>
-          <w:sz w:val="28"/>
-          <w:szCs w:val="28"/>
-        </w:rPr>
-        <w:t>.</w:t>
-      </w:r>
-    </w:p>
-    <w:p>
-      <w:pPr>
-        <w:spacing w:line="240" w:lineRule="auto"/>
-        <w:rPr>
-          <w:rStyle w:val="translatable-message"/>
-          <w:rFonts w:ascii="Times New Roman" w:hAnsi="Times New Roman" w:cs="Times New Roman"/>
-          <w:sz w:val="28"/>
-          <w:szCs w:val="28"/>
-        </w:rPr>
-      </w:pPr>
-      <w:r>
-        <w:rPr>
-          <w:rStyle w:val="translatable-message"/>
-          <w:rFonts w:ascii="Times New Roman" w:hAnsi="Times New Roman" w:cs="Times New Roman"/>
-          <w:b/>
-          <w:sz w:val="28"/>
-          <w:szCs w:val="28"/>
-        </w:rPr>
-        <w:t>Метрики контроля</w:t>
-      </w:r>
-    </w:p>
-    <w:p>
-      <w:pPr>
-        <w:spacing w:line="240" w:lineRule="auto"/>
-        <w:rPr>
-          <w:rStyle w:val="translatable-message"/>
-          <w:rFonts w:ascii="Times New Roman" w:hAnsi="Times New Roman" w:cs="Times New Roman"/>
-          <w:sz w:val="28"/>
-          <w:szCs w:val="28"/>
-        </w:rPr>
-      </w:pPr>
-      <w:r>
-        <w:rPr>
-          <w:rStyle w:val="translatable-message"/>
-          <w:rFonts w:ascii="Times New Roman" w:hAnsi="Times New Roman" w:cs="Times New Roman"/>
-          <w:sz w:val="28"/>
-          <w:szCs w:val="28"/>
-        </w:rPr>
-        <w:t xml:space="preserve">- </w:t>
-      </w:r>
-      <w:r>
-        <w:rPr>
-          <w:rStyle w:val="translatable-message"/>
-          <w:rFonts w:ascii="Times New Roman" w:hAnsi="Times New Roman" w:cs="Times New Roman"/>
-          <w:sz w:val="28"/>
-          <w:szCs w:val="28"/>
-        </w:rPr>
-        <w:t>Создание рабоч</w:t>
-      </w:r>
-      <w:r>
-        <w:rPr>
-          <w:rStyle w:val="translatable-message"/>
-          <w:rFonts w:ascii="Times New Roman" w:hAnsi="Times New Roman" w:cs="Times New Roman"/>
-          <w:sz w:val="28"/>
-          <w:szCs w:val="28"/>
-        </w:rPr>
-        <w:t>их</w:t>
-      </w:r>
-      <w:r>
-        <w:rPr>
-          <w:rStyle w:val="translatable-message"/>
-          <w:rFonts w:ascii="Times New Roman" w:hAnsi="Times New Roman" w:cs="Times New Roman"/>
-          <w:sz w:val="28"/>
-          <w:szCs w:val="28"/>
-        </w:rPr>
-        <w:t xml:space="preserve"> </w:t>
-      </w:r>
-      <w:r>
-        <w:rPr>
-          <w:rStyle w:val="translatable-message"/>
-          <w:rFonts w:ascii="Times New Roman" w:hAnsi="Times New Roman" w:cs="Times New Roman"/>
-          <w:sz w:val="28"/>
-          <w:szCs w:val="28"/>
-        </w:rPr>
         <w:t>сценари</w:t>
       </w:r>
       <w:r>
@@ -1296,17 +1392,7 @@
           <w:sz w:val="28"/>
           <w:szCs w:val="28"/>
         </w:rPr>
-        <w:t xml:space="preserve">риев, связанных с </w:t>
-      </w:r>
-      <w:r>
-        <w:rPr>
-          <w:rStyle w:val="translatable-message"/>
-          <w:rFonts w:ascii="Times New Roman" w:hAnsi="Times New Roman" w:cs="Times New Roman"/>
-          <w:sz w:val="28"/>
-          <w:szCs w:val="28"/>
-        </w:rPr>
-        <w:lastRenderedPageBreak/>
-        <w:t>просмотром обложек. К 26.05.2025 сценарий «Генерация обложек» будет работать на Мок-данных</w:t>
+        <w:t>риев, связанных с просмотром обложек. К 26.05.2025 сценарий «Генерация обложек» будет работать на Мок-данных</w:t>
       </w:r>
     </w:p>
     <w:p>

</xml_diff>

<commit_message>
fix(report): add team time costs
VM-163
</commit_message>
<xml_diff>
--- a/docs/report/11 спринт 24-05-25.docx
+++ b/docs/report/11 спринт 24-05-25.docx
@@ -1085,987 +1085,1321 @@
         </w:rPr>
         <w:t xml:space="preserve"> и мы пока ждем его обновления.</w:t>
       </w:r>
+    </w:p>
+    <w:p>
+      <w:pPr>
+        <w:spacing w:line="240" w:lineRule="auto"/>
+        <w:rPr>
+          <w:rStyle w:val="translatable-message"/>
+          <w:rFonts w:ascii="Times New Roman" w:hAnsi="Times New Roman" w:cs="Times New Roman"/>
+          <w:b/>
+          <w:sz w:val="28"/>
+          <w:szCs w:val="28"/>
+        </w:rPr>
+      </w:pPr>
+      <w:r>
+        <w:rPr>
+          <w:rStyle w:val="translatable-message"/>
+          <w:rFonts w:ascii="Times New Roman" w:hAnsi="Times New Roman" w:cs="Times New Roman"/>
+          <w:b/>
+          <w:sz w:val="28"/>
+          <w:szCs w:val="28"/>
+        </w:rPr>
+        <w:t>3. План на следующую неделю</w:t>
+      </w:r>
+    </w:p>
+    <w:p>
+      <w:pPr>
+        <w:spacing w:line="240" w:lineRule="auto"/>
+        <w:rPr>
+          <w:rStyle w:val="translatable-message"/>
+          <w:rFonts w:ascii="Times New Roman" w:hAnsi="Times New Roman" w:cs="Times New Roman"/>
+          <w:sz w:val="28"/>
+          <w:szCs w:val="28"/>
+        </w:rPr>
+      </w:pPr>
+      <w:r>
+        <w:rPr>
+          <w:rStyle w:val="translatable-message"/>
+          <w:rFonts w:ascii="Times New Roman" w:hAnsi="Times New Roman" w:cs="Times New Roman"/>
+          <w:sz w:val="28"/>
+          <w:szCs w:val="28"/>
+        </w:rPr>
+        <w:t>Приоритеты:</w:t>
+      </w:r>
+    </w:p>
+    <w:p>
+      <w:pPr>
+        <w:spacing w:line="240" w:lineRule="auto"/>
+        <w:rPr>
+          <w:rStyle w:val="translatable-message"/>
+          <w:rFonts w:ascii="Times New Roman" w:hAnsi="Times New Roman" w:cs="Times New Roman"/>
+          <w:sz w:val="28"/>
+          <w:szCs w:val="28"/>
+        </w:rPr>
+      </w:pPr>
+      <w:r>
+        <w:rPr>
+          <w:rStyle w:val="translatable-message"/>
+          <w:rFonts w:ascii="Times New Roman" w:hAnsi="Times New Roman" w:cs="Times New Roman"/>
+          <w:sz w:val="28"/>
+          <w:szCs w:val="28"/>
+        </w:rPr>
+        <w:t xml:space="preserve">- </w:t>
+      </w:r>
+      <w:r>
+        <w:rPr>
+          <w:rStyle w:val="translatable-message"/>
+          <w:rFonts w:ascii="Times New Roman" w:hAnsi="Times New Roman" w:cs="Times New Roman"/>
+          <w:sz w:val="28"/>
+          <w:szCs w:val="28"/>
+        </w:rPr>
+        <w:t xml:space="preserve">Реализовать </w:t>
+      </w:r>
+      <w:r>
+        <w:rPr>
+          <w:rStyle w:val="translatable-message"/>
+          <w:rFonts w:ascii="Times New Roman" w:hAnsi="Times New Roman" w:cs="Times New Roman"/>
+          <w:sz w:val="28"/>
+          <w:szCs w:val="28"/>
+        </w:rPr>
+        <w:t>пользовательский сценарий «Генерация»;</w:t>
+      </w:r>
+      <w:r>
+        <w:rPr>
+          <w:rStyle w:val="translatable-message"/>
+          <w:rFonts w:ascii="Times New Roman" w:hAnsi="Times New Roman" w:cs="Times New Roman"/>
+          <w:sz w:val="28"/>
+          <w:szCs w:val="28"/>
+        </w:rPr>
+        <w:t xml:space="preserve"> </w:t>
+      </w:r>
+      <w:r>
+        <w:rPr>
+          <w:rStyle w:val="translatable-message"/>
+          <w:rFonts w:ascii="Times New Roman" w:hAnsi="Times New Roman" w:cs="Times New Roman"/>
+          <w:sz w:val="28"/>
+          <w:szCs w:val="28"/>
+        </w:rPr>
+        <w:br/>
+        <w:t xml:space="preserve">- </w:t>
+      </w:r>
+      <w:r>
+        <w:rPr>
+          <w:rStyle w:val="translatable-message"/>
+          <w:rFonts w:ascii="Times New Roman" w:hAnsi="Times New Roman" w:cs="Times New Roman"/>
+          <w:sz w:val="28"/>
+          <w:szCs w:val="28"/>
+        </w:rPr>
+        <w:t xml:space="preserve">Доделать админ </w:t>
+      </w:r>
+      <w:proofErr w:type="gramStart"/>
+      <w:r>
+        <w:rPr>
+          <w:rStyle w:val="translatable-message"/>
+          <w:rFonts w:ascii="Times New Roman" w:hAnsi="Times New Roman" w:cs="Times New Roman"/>
+          <w:sz w:val="28"/>
+          <w:szCs w:val="28"/>
+        </w:rPr>
+        <w:t>панель</w:t>
+      </w:r>
+      <w:r>
+        <w:rPr>
+          <w:rStyle w:val="translatable-message"/>
+          <w:rFonts w:ascii="Times New Roman" w:hAnsi="Times New Roman" w:cs="Times New Roman"/>
+          <w:sz w:val="28"/>
+          <w:szCs w:val="28"/>
+        </w:rPr>
+        <w:t>;</w:t>
+      </w:r>
+      <w:r>
+        <w:rPr>
+          <w:rStyle w:val="translatable-message"/>
+          <w:rFonts w:ascii="Times New Roman" w:hAnsi="Times New Roman" w:cs="Times New Roman"/>
+          <w:sz w:val="28"/>
+          <w:szCs w:val="28"/>
+        </w:rPr>
+        <w:br/>
+      </w:r>
+      <w:r>
+        <w:rPr>
+          <w:rStyle w:val="translatable-message"/>
+          <w:rFonts w:ascii="Times New Roman" w:hAnsi="Times New Roman" w:cs="Times New Roman"/>
+          <w:sz w:val="28"/>
+          <w:szCs w:val="28"/>
+        </w:rPr>
+        <w:t>-</w:t>
+      </w:r>
+      <w:proofErr w:type="gramEnd"/>
+      <w:r>
+        <w:rPr>
+          <w:rStyle w:val="translatable-message"/>
+          <w:rFonts w:ascii="Times New Roman" w:hAnsi="Times New Roman" w:cs="Times New Roman"/>
+          <w:sz w:val="28"/>
+          <w:szCs w:val="28"/>
+        </w:rPr>
+        <w:t xml:space="preserve"> Покрыть юнит-тестами экраны регистрации и аутентификации;</w:t>
+      </w:r>
+      <w:r>
+        <w:rPr>
+          <w:rStyle w:val="translatable-message"/>
+          <w:rFonts w:ascii="Times New Roman" w:hAnsi="Times New Roman" w:cs="Times New Roman"/>
+          <w:sz w:val="28"/>
+          <w:szCs w:val="28"/>
+        </w:rPr>
+        <w:br/>
+        <w:t>- Связать админ панель с базой данных</w:t>
+      </w:r>
+      <w:r>
+        <w:rPr>
+          <w:rStyle w:val="translatable-message"/>
+          <w:rFonts w:ascii="Times New Roman" w:hAnsi="Times New Roman" w:cs="Times New Roman"/>
+          <w:sz w:val="28"/>
+          <w:szCs w:val="28"/>
+        </w:rPr>
+        <w:t xml:space="preserve"> пользователей</w:t>
+      </w:r>
+      <w:r>
+        <w:rPr>
+          <w:rStyle w:val="translatable-message"/>
+          <w:rFonts w:ascii="Times New Roman" w:hAnsi="Times New Roman" w:cs="Times New Roman"/>
+          <w:sz w:val="28"/>
+          <w:szCs w:val="28"/>
+        </w:rPr>
+        <w:t>.</w:t>
+      </w:r>
+    </w:p>
+    <w:p>
+      <w:pPr>
+        <w:spacing w:line="240" w:lineRule="auto"/>
+        <w:rPr>
+          <w:rStyle w:val="translatable-message"/>
+          <w:rFonts w:ascii="Times New Roman" w:hAnsi="Times New Roman" w:cs="Times New Roman"/>
+          <w:sz w:val="28"/>
+          <w:szCs w:val="28"/>
+        </w:rPr>
+      </w:pPr>
+      <w:r>
+        <w:rPr>
+          <w:rStyle w:val="translatable-message"/>
+          <w:rFonts w:ascii="Times New Roman" w:hAnsi="Times New Roman" w:cs="Times New Roman"/>
+          <w:b/>
+          <w:sz w:val="28"/>
+          <w:szCs w:val="28"/>
+        </w:rPr>
+        <w:t>Метрики контроля</w:t>
+      </w:r>
+    </w:p>
+    <w:p>
+      <w:pPr>
+        <w:spacing w:line="240" w:lineRule="auto"/>
+        <w:rPr>
+          <w:rStyle w:val="translatable-message"/>
+          <w:rFonts w:ascii="Times New Roman" w:hAnsi="Times New Roman" w:cs="Times New Roman"/>
+          <w:sz w:val="28"/>
+          <w:szCs w:val="28"/>
+        </w:rPr>
+      </w:pPr>
+      <w:r>
+        <w:rPr>
+          <w:rStyle w:val="translatable-message"/>
+          <w:rFonts w:ascii="Times New Roman" w:hAnsi="Times New Roman" w:cs="Times New Roman"/>
+          <w:sz w:val="28"/>
+          <w:szCs w:val="28"/>
+        </w:rPr>
+        <w:lastRenderedPageBreak/>
+        <w:t xml:space="preserve">- </w:t>
+      </w:r>
+      <w:r>
+        <w:rPr>
+          <w:rStyle w:val="translatable-message"/>
+          <w:rFonts w:ascii="Times New Roman" w:hAnsi="Times New Roman" w:cs="Times New Roman"/>
+          <w:sz w:val="28"/>
+          <w:szCs w:val="28"/>
+        </w:rPr>
+        <w:t>Создание рабоч</w:t>
+      </w:r>
+      <w:r>
+        <w:rPr>
+          <w:rStyle w:val="translatable-message"/>
+          <w:rFonts w:ascii="Times New Roman" w:hAnsi="Times New Roman" w:cs="Times New Roman"/>
+          <w:sz w:val="28"/>
+          <w:szCs w:val="28"/>
+        </w:rPr>
+        <w:t>их</w:t>
+      </w:r>
+      <w:r>
+        <w:rPr>
+          <w:rStyle w:val="translatable-message"/>
+          <w:rFonts w:ascii="Times New Roman" w:hAnsi="Times New Roman" w:cs="Times New Roman"/>
+          <w:sz w:val="28"/>
+          <w:szCs w:val="28"/>
+        </w:rPr>
+        <w:t xml:space="preserve"> </w:t>
+      </w:r>
+      <w:r>
+        <w:rPr>
+          <w:rStyle w:val="translatable-message"/>
+          <w:rFonts w:ascii="Times New Roman" w:hAnsi="Times New Roman" w:cs="Times New Roman"/>
+          <w:sz w:val="28"/>
+          <w:szCs w:val="28"/>
+        </w:rPr>
+        <w:t>сценари</w:t>
+      </w:r>
+      <w:r>
+        <w:rPr>
+          <w:rStyle w:val="translatable-message"/>
+          <w:rFonts w:ascii="Times New Roman" w:hAnsi="Times New Roman" w:cs="Times New Roman"/>
+          <w:sz w:val="28"/>
+          <w:szCs w:val="28"/>
+        </w:rPr>
+        <w:t>ев «Просмотр обложек» и «</w:t>
+      </w:r>
+      <w:r>
+        <w:rPr>
+          <w:rStyle w:val="translatable-message"/>
+          <w:rFonts w:ascii="Times New Roman" w:hAnsi="Times New Roman" w:cs="Times New Roman"/>
+          <w:sz w:val="28"/>
+          <w:szCs w:val="28"/>
+        </w:rPr>
+        <w:t xml:space="preserve">Генерация обложек» к 24.05.2025 не было реализовано, так как </w:t>
+      </w:r>
+      <w:r>
+        <w:rPr>
+          <w:rStyle w:val="translatable-message"/>
+          <w:rFonts w:ascii="Times New Roman" w:hAnsi="Times New Roman" w:cs="Times New Roman"/>
+          <w:sz w:val="28"/>
+          <w:szCs w:val="28"/>
+          <w:lang w:val="en-US"/>
+        </w:rPr>
+        <w:t>backend</w:t>
+      </w:r>
+      <w:r>
+        <w:rPr>
+          <w:rStyle w:val="translatable-message"/>
+          <w:rFonts w:ascii="Times New Roman" w:hAnsi="Times New Roman" w:cs="Times New Roman"/>
+          <w:sz w:val="28"/>
+          <w:szCs w:val="28"/>
+        </w:rPr>
+        <w:t>-разработчику потребовалось больше времени на реализацию сцена</w:t>
+      </w:r>
+      <w:r>
+        <w:rPr>
+          <w:rStyle w:val="translatable-message"/>
+          <w:rFonts w:ascii="Times New Roman" w:hAnsi="Times New Roman" w:cs="Times New Roman"/>
+          <w:sz w:val="28"/>
+          <w:szCs w:val="28"/>
+        </w:rPr>
+        <w:t>риев, связанных с просмотром обложек. К 26.05.2025 сценарий «Генерация обложек» будет работать на Мок-данных</w:t>
+      </w:r>
+    </w:p>
+    <w:p>
+      <w:pPr>
+        <w:spacing w:line="240" w:lineRule="auto"/>
+        <w:rPr>
+          <w:rStyle w:val="translatable-message"/>
+          <w:rFonts w:ascii="Times New Roman" w:hAnsi="Times New Roman" w:cs="Times New Roman"/>
+          <w:sz w:val="28"/>
+          <w:szCs w:val="28"/>
+        </w:rPr>
+      </w:pPr>
+      <w:r>
+        <w:rPr>
+          <w:rStyle w:val="translatable-message"/>
+          <w:rFonts w:ascii="Times New Roman" w:hAnsi="Times New Roman" w:cs="Times New Roman"/>
+          <w:sz w:val="28"/>
+          <w:szCs w:val="28"/>
+        </w:rPr>
+        <w:t>- Полноценная реализация сценариев генерации должна быть реализована к 31.05.2025.</w:t>
+      </w:r>
+      <w:r>
+        <w:rPr>
+          <w:rStyle w:val="translatable-message"/>
+          <w:rFonts w:ascii="Times New Roman" w:hAnsi="Times New Roman" w:cs="Times New Roman"/>
+          <w:sz w:val="28"/>
+          <w:szCs w:val="28"/>
+        </w:rPr>
+        <w:br/>
+      </w:r>
+    </w:p>
+    <w:p>
+      <w:pPr>
+        <w:spacing w:line="240" w:lineRule="auto"/>
+        <w:rPr>
+          <w:rStyle w:val="translatable-message"/>
+          <w:rFonts w:ascii="Times New Roman" w:hAnsi="Times New Roman" w:cs="Times New Roman"/>
+          <w:b/>
+          <w:sz w:val="28"/>
+          <w:szCs w:val="28"/>
+        </w:rPr>
+      </w:pPr>
+      <w:r>
+        <w:rPr>
+          <w:rStyle w:val="translatable-message"/>
+          <w:rFonts w:ascii="Times New Roman" w:hAnsi="Times New Roman" w:cs="Times New Roman"/>
+          <w:b/>
+          <w:sz w:val="28"/>
+          <w:szCs w:val="28"/>
+        </w:rPr>
+        <w:t>4</w:t>
+      </w:r>
+      <w:r>
+        <w:rPr>
+          <w:rStyle w:val="translatable-message"/>
+          <w:rFonts w:ascii="Times New Roman" w:hAnsi="Times New Roman" w:cs="Times New Roman"/>
+          <w:b/>
+          <w:sz w:val="28"/>
+          <w:szCs w:val="28"/>
+        </w:rPr>
+        <w:t>. Заключение PM</w:t>
+      </w:r>
+    </w:p>
+    <w:p>
+      <w:pPr>
+        <w:spacing w:line="240" w:lineRule="auto"/>
+        <w:rPr>
+          <w:rStyle w:val="translatable-message"/>
+          <w:rFonts w:ascii="Times New Roman" w:hAnsi="Times New Roman" w:cs="Times New Roman"/>
+          <w:sz w:val="28"/>
+          <w:szCs w:val="28"/>
+        </w:rPr>
+      </w:pPr>
+      <w:r>
+        <w:rPr>
+          <w:rStyle w:val="translatable-message"/>
+          <w:rFonts w:ascii="Times New Roman" w:hAnsi="Times New Roman" w:cs="Times New Roman"/>
+          <w:sz w:val="28"/>
+          <w:szCs w:val="28"/>
+        </w:rPr>
+        <w:t xml:space="preserve">Проект </w:t>
+      </w:r>
+      <w:r>
+        <w:rPr>
+          <w:rStyle w:val="translatable-message"/>
+          <w:rFonts w:ascii="Times New Roman" w:hAnsi="Times New Roman" w:cs="Times New Roman"/>
+          <w:sz w:val="28"/>
+          <w:szCs w:val="28"/>
+        </w:rPr>
+        <w:t>отстает от плана. Т</w:t>
+      </w:r>
+      <w:r>
+        <w:rPr>
+          <w:rStyle w:val="translatable-message"/>
+          <w:rFonts w:ascii="Times New Roman" w:hAnsi="Times New Roman" w:cs="Times New Roman"/>
+          <w:sz w:val="28"/>
+          <w:szCs w:val="28"/>
+        </w:rPr>
+        <w:t>ребуе</w:t>
+      </w:r>
+      <w:r>
+        <w:rPr>
+          <w:rStyle w:val="translatable-message"/>
+          <w:rFonts w:ascii="Times New Roman" w:hAnsi="Times New Roman" w:cs="Times New Roman"/>
+          <w:sz w:val="28"/>
+          <w:szCs w:val="28"/>
+        </w:rPr>
+        <w:t>т</w:t>
+      </w:r>
+      <w:r>
+        <w:rPr>
+          <w:rStyle w:val="translatable-message"/>
+          <w:rFonts w:ascii="Times New Roman" w:hAnsi="Times New Roman" w:cs="Times New Roman"/>
+          <w:sz w:val="28"/>
+          <w:szCs w:val="28"/>
+        </w:rPr>
+        <w:t>ся</w:t>
+      </w:r>
+      <w:r>
+        <w:rPr>
+          <w:rStyle w:val="translatable-message"/>
+          <w:rFonts w:ascii="Times New Roman" w:hAnsi="Times New Roman" w:cs="Times New Roman"/>
+          <w:sz w:val="28"/>
+          <w:szCs w:val="28"/>
+        </w:rPr>
+        <w:t xml:space="preserve"> ускорени</w:t>
+      </w:r>
+      <w:r>
+        <w:rPr>
+          <w:rStyle w:val="translatable-message"/>
+          <w:rFonts w:ascii="Times New Roman" w:hAnsi="Times New Roman" w:cs="Times New Roman"/>
+          <w:sz w:val="28"/>
+          <w:szCs w:val="28"/>
+        </w:rPr>
+        <w:t>е</w:t>
+      </w:r>
+      <w:r>
+        <w:rPr>
+          <w:rStyle w:val="translatable-message"/>
+          <w:rFonts w:ascii="Times New Roman" w:hAnsi="Times New Roman" w:cs="Times New Roman"/>
+          <w:sz w:val="28"/>
+          <w:szCs w:val="28"/>
+        </w:rPr>
+        <w:t xml:space="preserve"> работы над </w:t>
+      </w:r>
+      <w:proofErr w:type="spellStart"/>
+      <w:r>
+        <w:rPr>
+          <w:rStyle w:val="translatable-message"/>
+          <w:rFonts w:ascii="Times New Roman" w:hAnsi="Times New Roman" w:cs="Times New Roman"/>
+          <w:sz w:val="28"/>
+          <w:szCs w:val="28"/>
+        </w:rPr>
+        <w:t>бэкенд</w:t>
+      </w:r>
+      <w:proofErr w:type="spellEnd"/>
+      <w:r>
+        <w:rPr>
+          <w:rStyle w:val="translatable-message"/>
+          <w:rFonts w:ascii="Times New Roman" w:hAnsi="Times New Roman" w:cs="Times New Roman"/>
+          <w:sz w:val="28"/>
+          <w:szCs w:val="28"/>
+        </w:rPr>
+        <w:t>-частью</w:t>
+      </w:r>
+      <w:r>
+        <w:rPr>
+          <w:rStyle w:val="translatable-message"/>
+          <w:rFonts w:ascii="Times New Roman" w:hAnsi="Times New Roman" w:cs="Times New Roman"/>
+          <w:sz w:val="28"/>
+          <w:szCs w:val="28"/>
+        </w:rPr>
+        <w:t>, внедрением аналитики и покрытием тестами основных пользовательских сценариев.</w:t>
+      </w:r>
+    </w:p>
+    <w:p>
+      <w:pPr>
+        <w:spacing w:line="240" w:lineRule="auto"/>
+        <w:rPr>
+          <w:rStyle w:val="translatable-message"/>
+          <w:rFonts w:ascii="Times New Roman" w:hAnsi="Times New Roman" w:cs="Times New Roman"/>
+          <w:sz w:val="28"/>
+          <w:szCs w:val="28"/>
+        </w:rPr>
+      </w:pPr>
+      <w:r>
+        <w:rPr>
+          <w:rStyle w:val="translatable-message"/>
+          <w:rFonts w:ascii="Times New Roman" w:hAnsi="Times New Roman" w:cs="Times New Roman"/>
+          <w:sz w:val="28"/>
+          <w:szCs w:val="28"/>
+        </w:rPr>
+        <w:t xml:space="preserve">К предзащите </w:t>
+      </w:r>
+      <w:proofErr w:type="gramStart"/>
+      <w:r>
+        <w:rPr>
+          <w:rStyle w:val="translatable-message"/>
+          <w:rFonts w:ascii="Times New Roman" w:hAnsi="Times New Roman" w:cs="Times New Roman"/>
+          <w:sz w:val="28"/>
+          <w:szCs w:val="28"/>
+        </w:rPr>
+        <w:t>готово:</w:t>
+      </w:r>
+      <w:r>
+        <w:rPr>
+          <w:rStyle w:val="translatable-message"/>
+          <w:rFonts w:ascii="Times New Roman" w:hAnsi="Times New Roman" w:cs="Times New Roman"/>
+          <w:sz w:val="28"/>
+          <w:szCs w:val="28"/>
+        </w:rPr>
+        <w:br/>
+        <w:t>-</w:t>
+      </w:r>
+      <w:proofErr w:type="gramEnd"/>
+      <w:r>
+        <w:rPr>
+          <w:rStyle w:val="translatable-message"/>
+          <w:rFonts w:ascii="Times New Roman" w:hAnsi="Times New Roman" w:cs="Times New Roman"/>
+          <w:sz w:val="28"/>
+          <w:szCs w:val="28"/>
+        </w:rPr>
+        <w:t xml:space="preserve"> завершен </w:t>
+      </w:r>
+      <w:r>
+        <w:rPr>
+          <w:rStyle w:val="translatable-message"/>
+          <w:rFonts w:ascii="Times New Roman" w:hAnsi="Times New Roman" w:cs="Times New Roman"/>
+          <w:sz w:val="28"/>
+          <w:szCs w:val="28"/>
+          <w:lang w:val="en-US"/>
+        </w:rPr>
+        <w:t>UI</w:t>
+      </w:r>
+      <w:r>
+        <w:rPr>
+          <w:rStyle w:val="translatable-message"/>
+          <w:rFonts w:ascii="Times New Roman" w:hAnsi="Times New Roman" w:cs="Times New Roman"/>
+          <w:sz w:val="28"/>
+          <w:szCs w:val="28"/>
+        </w:rPr>
+        <w:t xml:space="preserve">-дизайн в соответствии с макетами </w:t>
+      </w:r>
+      <w:proofErr w:type="spellStart"/>
+      <w:r>
+        <w:rPr>
+          <w:rStyle w:val="translatable-message"/>
+          <w:rFonts w:ascii="Times New Roman" w:hAnsi="Times New Roman" w:cs="Times New Roman"/>
+          <w:sz w:val="28"/>
+          <w:szCs w:val="28"/>
+          <w:lang w:val="en-US"/>
+        </w:rPr>
+        <w:t>Figma</w:t>
+      </w:r>
+      <w:proofErr w:type="spellEnd"/>
+      <w:r>
+        <w:rPr>
+          <w:rStyle w:val="translatable-message"/>
+          <w:rFonts w:ascii="Times New Roman" w:hAnsi="Times New Roman" w:cs="Times New Roman"/>
+          <w:sz w:val="28"/>
+          <w:szCs w:val="28"/>
+        </w:rPr>
+        <w:t>;</w:t>
+      </w:r>
+      <w:r>
+        <w:rPr>
+          <w:rStyle w:val="translatable-message"/>
+          <w:rFonts w:ascii="Times New Roman" w:hAnsi="Times New Roman" w:cs="Times New Roman"/>
+          <w:sz w:val="28"/>
+          <w:szCs w:val="28"/>
+        </w:rPr>
+        <w:br/>
+        <w:t>-</w:t>
+      </w:r>
+      <w:r>
+        <w:rPr>
+          <w:rStyle w:val="translatable-message"/>
+          <w:rFonts w:ascii="Times New Roman" w:hAnsi="Times New Roman" w:cs="Times New Roman"/>
+          <w:sz w:val="28"/>
+          <w:szCs w:val="28"/>
+        </w:rPr>
+        <w:t xml:space="preserve"> </w:t>
+      </w:r>
+      <w:r>
+        <w:rPr>
+          <w:rStyle w:val="translatable-message"/>
+          <w:rFonts w:ascii="Times New Roman" w:hAnsi="Times New Roman" w:cs="Times New Roman"/>
+          <w:sz w:val="28"/>
+          <w:szCs w:val="28"/>
+        </w:rPr>
+        <w:t xml:space="preserve">сверстаны все экраны </w:t>
+      </w:r>
+      <w:r>
+        <w:rPr>
+          <w:rStyle w:val="translatable-message"/>
+          <w:rFonts w:ascii="Times New Roman" w:hAnsi="Times New Roman" w:cs="Times New Roman"/>
+          <w:sz w:val="28"/>
+          <w:szCs w:val="28"/>
+          <w:lang w:val="en-US"/>
+        </w:rPr>
+        <w:t>android</w:t>
+      </w:r>
+      <w:r>
+        <w:rPr>
+          <w:rStyle w:val="translatable-message"/>
+          <w:rFonts w:ascii="Times New Roman" w:hAnsi="Times New Roman" w:cs="Times New Roman"/>
+          <w:sz w:val="28"/>
+          <w:szCs w:val="28"/>
+        </w:rPr>
+        <w:t>-</w:t>
+      </w:r>
+      <w:r>
+        <w:rPr>
+          <w:rStyle w:val="translatable-message"/>
+          <w:rFonts w:ascii="Times New Roman" w:hAnsi="Times New Roman" w:cs="Times New Roman"/>
+          <w:sz w:val="28"/>
+          <w:szCs w:val="28"/>
+        </w:rPr>
+        <w:t>приложения</w:t>
+      </w:r>
+      <w:r>
+        <w:rPr>
+          <w:rStyle w:val="translatable-message"/>
+          <w:rFonts w:ascii="Times New Roman" w:hAnsi="Times New Roman" w:cs="Times New Roman"/>
+          <w:sz w:val="28"/>
+          <w:szCs w:val="28"/>
+        </w:rPr>
+        <w:t>;</w:t>
+      </w:r>
+      <w:r>
+        <w:rPr>
+          <w:rStyle w:val="translatable-message"/>
+          <w:rFonts w:ascii="Times New Roman" w:hAnsi="Times New Roman" w:cs="Times New Roman"/>
+          <w:sz w:val="28"/>
+          <w:szCs w:val="28"/>
+        </w:rPr>
+        <w:br/>
+        <w:t>-</w:t>
+      </w:r>
+      <w:r>
+        <w:rPr>
+          <w:rStyle w:val="translatable-message"/>
+          <w:rFonts w:ascii="Times New Roman" w:hAnsi="Times New Roman" w:cs="Times New Roman"/>
+          <w:sz w:val="28"/>
+          <w:szCs w:val="28"/>
+        </w:rPr>
+        <w:t xml:space="preserve"> </w:t>
+      </w:r>
+      <w:r>
+        <w:rPr>
+          <w:rStyle w:val="translatable-message"/>
+          <w:rFonts w:ascii="Times New Roman" w:hAnsi="Times New Roman" w:cs="Times New Roman"/>
+          <w:sz w:val="28"/>
+          <w:szCs w:val="28"/>
+        </w:rPr>
+        <w:t xml:space="preserve">реализованы сценарии </w:t>
+      </w:r>
+      <w:r>
+        <w:rPr>
+          <w:rStyle w:val="translatable-message"/>
+          <w:rFonts w:ascii="Times New Roman" w:hAnsi="Times New Roman" w:cs="Times New Roman"/>
+          <w:sz w:val="28"/>
+          <w:szCs w:val="28"/>
+        </w:rPr>
+        <w:t>«</w:t>
+      </w:r>
+      <w:r>
+        <w:rPr>
+          <w:rStyle w:val="translatable-message"/>
+          <w:rFonts w:ascii="Times New Roman" w:hAnsi="Times New Roman" w:cs="Times New Roman"/>
+          <w:sz w:val="28"/>
+          <w:szCs w:val="28"/>
+        </w:rPr>
+        <w:t>авторизация</w:t>
+      </w:r>
+      <w:r>
+        <w:rPr>
+          <w:rStyle w:val="translatable-message"/>
+          <w:rFonts w:ascii="Times New Roman" w:hAnsi="Times New Roman" w:cs="Times New Roman"/>
+          <w:sz w:val="28"/>
+          <w:szCs w:val="28"/>
+        </w:rPr>
+        <w:t>»</w:t>
+      </w:r>
+      <w:r>
+        <w:rPr>
+          <w:rStyle w:val="translatable-message"/>
+          <w:rFonts w:ascii="Times New Roman" w:hAnsi="Times New Roman" w:cs="Times New Roman"/>
+          <w:sz w:val="28"/>
+          <w:szCs w:val="28"/>
+        </w:rPr>
+        <w:t xml:space="preserve">, </w:t>
+      </w:r>
+      <w:r>
+        <w:rPr>
+          <w:rStyle w:val="translatable-message"/>
+          <w:rFonts w:ascii="Times New Roman" w:hAnsi="Times New Roman" w:cs="Times New Roman"/>
+          <w:sz w:val="28"/>
+          <w:szCs w:val="28"/>
+        </w:rPr>
+        <w:t>«</w:t>
+      </w:r>
+      <w:r>
+        <w:rPr>
+          <w:rStyle w:val="translatable-message"/>
+          <w:rFonts w:ascii="Times New Roman" w:hAnsi="Times New Roman" w:cs="Times New Roman"/>
+          <w:sz w:val="28"/>
+          <w:szCs w:val="28"/>
+        </w:rPr>
+        <w:t>регистрация</w:t>
+      </w:r>
+      <w:r>
+        <w:rPr>
+          <w:rStyle w:val="translatable-message"/>
+          <w:rFonts w:ascii="Times New Roman" w:hAnsi="Times New Roman" w:cs="Times New Roman"/>
+          <w:sz w:val="28"/>
+          <w:szCs w:val="28"/>
+        </w:rPr>
+        <w:t>»</w:t>
+      </w:r>
+      <w:r>
+        <w:rPr>
+          <w:rStyle w:val="translatable-message"/>
+          <w:rFonts w:ascii="Times New Roman" w:hAnsi="Times New Roman" w:cs="Times New Roman"/>
+          <w:sz w:val="28"/>
+          <w:szCs w:val="28"/>
+        </w:rPr>
+        <w:t xml:space="preserve">, </w:t>
+      </w:r>
+      <w:r>
+        <w:rPr>
+          <w:rStyle w:val="translatable-message"/>
+          <w:rFonts w:ascii="Times New Roman" w:hAnsi="Times New Roman" w:cs="Times New Roman"/>
+          <w:sz w:val="28"/>
+          <w:szCs w:val="28"/>
+        </w:rPr>
+        <w:t>«</w:t>
+      </w:r>
+      <w:r>
+        <w:rPr>
+          <w:rStyle w:val="translatable-message"/>
+          <w:rFonts w:ascii="Times New Roman" w:hAnsi="Times New Roman" w:cs="Times New Roman"/>
+          <w:sz w:val="28"/>
+          <w:szCs w:val="28"/>
+        </w:rPr>
+        <w:t>просмотр обложек</w:t>
+      </w:r>
+      <w:r>
+        <w:rPr>
+          <w:rStyle w:val="translatable-message"/>
+          <w:rFonts w:ascii="Times New Roman" w:hAnsi="Times New Roman" w:cs="Times New Roman"/>
+          <w:sz w:val="28"/>
+          <w:szCs w:val="28"/>
+        </w:rPr>
+        <w:t>»</w:t>
+      </w:r>
+      <w:r>
+        <w:rPr>
+          <w:rStyle w:val="translatable-message"/>
+          <w:rFonts w:ascii="Times New Roman" w:hAnsi="Times New Roman" w:cs="Times New Roman"/>
+          <w:sz w:val="28"/>
+          <w:szCs w:val="28"/>
+        </w:rPr>
+        <w:t>;</w:t>
+      </w:r>
+      <w:r>
+        <w:rPr>
+          <w:rStyle w:val="translatable-message"/>
+          <w:rFonts w:ascii="Times New Roman" w:hAnsi="Times New Roman" w:cs="Times New Roman"/>
+          <w:sz w:val="28"/>
+          <w:szCs w:val="28"/>
+        </w:rPr>
+        <w:br/>
+        <w:t xml:space="preserve">- </w:t>
+      </w:r>
+      <w:r>
+        <w:rPr>
+          <w:rStyle w:val="translatable-message"/>
+          <w:rFonts w:ascii="Times New Roman" w:hAnsi="Times New Roman" w:cs="Times New Roman"/>
+          <w:sz w:val="28"/>
+          <w:szCs w:val="28"/>
+        </w:rPr>
+        <w:t>сверстана админ панель.</w:t>
+      </w:r>
+    </w:p>
+    <w:p>
+      <w:pPr>
+        <w:spacing w:line="240" w:lineRule="auto"/>
+        <w:rPr>
+          <w:rStyle w:val="translatable-message"/>
+          <w:rFonts w:ascii="Times New Roman" w:hAnsi="Times New Roman" w:cs="Times New Roman"/>
+          <w:sz w:val="28"/>
+          <w:szCs w:val="28"/>
+        </w:rPr>
+      </w:pPr>
+      <w:r>
+        <w:rPr>
+          <w:rStyle w:val="translatable-message"/>
+          <w:rFonts w:ascii="Times New Roman" w:hAnsi="Times New Roman" w:cs="Times New Roman"/>
+          <w:sz w:val="28"/>
+          <w:szCs w:val="28"/>
+        </w:rPr>
+        <w:t xml:space="preserve">Оставшиеся доработки перед финальной </w:t>
+      </w:r>
+      <w:proofErr w:type="gramStart"/>
+      <w:r>
+        <w:rPr>
+          <w:rStyle w:val="translatable-message"/>
+          <w:rFonts w:ascii="Times New Roman" w:hAnsi="Times New Roman" w:cs="Times New Roman"/>
+          <w:sz w:val="28"/>
+          <w:szCs w:val="28"/>
+        </w:rPr>
+        <w:t>защитой:</w:t>
+      </w:r>
+      <w:r>
+        <w:rPr>
+          <w:rStyle w:val="translatable-message"/>
+          <w:rFonts w:ascii="Times New Roman" w:hAnsi="Times New Roman" w:cs="Times New Roman"/>
+          <w:sz w:val="28"/>
+          <w:szCs w:val="28"/>
+        </w:rPr>
+        <w:br/>
+        <w:t>-</w:t>
+      </w:r>
+      <w:proofErr w:type="gramEnd"/>
+      <w:r>
+        <w:rPr>
+          <w:rStyle w:val="translatable-message"/>
+          <w:rFonts w:ascii="Times New Roman" w:hAnsi="Times New Roman" w:cs="Times New Roman"/>
+          <w:sz w:val="28"/>
+          <w:szCs w:val="28"/>
+        </w:rPr>
+        <w:t xml:space="preserve"> реализовать </w:t>
+      </w:r>
+      <w:r>
+        <w:rPr>
+          <w:rStyle w:val="translatable-message"/>
+          <w:rFonts w:ascii="Times New Roman" w:hAnsi="Times New Roman" w:cs="Times New Roman"/>
+          <w:sz w:val="28"/>
+          <w:szCs w:val="28"/>
+        </w:rPr>
+        <w:t>сценарии</w:t>
+      </w:r>
+      <w:r>
+        <w:rPr>
+          <w:rStyle w:val="translatable-message"/>
+          <w:rFonts w:ascii="Times New Roman" w:hAnsi="Times New Roman" w:cs="Times New Roman"/>
+          <w:sz w:val="28"/>
+          <w:szCs w:val="28"/>
+        </w:rPr>
+        <w:t xml:space="preserve"> генераци</w:t>
+      </w:r>
+      <w:r>
+        <w:rPr>
+          <w:rStyle w:val="translatable-message"/>
+          <w:rFonts w:ascii="Times New Roman" w:hAnsi="Times New Roman" w:cs="Times New Roman"/>
+          <w:sz w:val="28"/>
+          <w:szCs w:val="28"/>
+        </w:rPr>
+        <w:t>и в режимах «Автоматический режим»</w:t>
+      </w:r>
+      <w:r>
+        <w:rPr>
+          <w:rStyle w:val="translatable-message"/>
+          <w:rFonts w:ascii="Times New Roman" w:hAnsi="Times New Roman" w:cs="Times New Roman"/>
+          <w:sz w:val="28"/>
+          <w:szCs w:val="28"/>
+        </w:rPr>
+        <w:t>,</w:t>
+      </w:r>
+      <w:r>
+        <w:rPr>
+          <w:rStyle w:val="translatable-message"/>
+          <w:rFonts w:ascii="Times New Roman" w:hAnsi="Times New Roman" w:cs="Times New Roman"/>
+          <w:sz w:val="28"/>
+          <w:szCs w:val="28"/>
+        </w:rPr>
+        <w:t xml:space="preserve"> </w:t>
+      </w:r>
+      <w:r>
+        <w:rPr>
+          <w:rStyle w:val="translatable-message"/>
+          <w:rFonts w:ascii="Times New Roman" w:hAnsi="Times New Roman" w:cs="Times New Roman"/>
+          <w:sz w:val="28"/>
+          <w:szCs w:val="28"/>
+        </w:rPr>
+        <w:t>«Детальная настройка»</w:t>
+      </w:r>
+      <w:r>
+        <w:rPr>
+          <w:rStyle w:val="translatable-message"/>
+          <w:rFonts w:ascii="Times New Roman" w:hAnsi="Times New Roman" w:cs="Times New Roman"/>
+          <w:sz w:val="28"/>
+          <w:szCs w:val="28"/>
+        </w:rPr>
+        <w:t xml:space="preserve">, </w:t>
+      </w:r>
+      <w:r>
+        <w:rPr>
+          <w:rStyle w:val="translatable-message"/>
+          <w:rFonts w:ascii="Times New Roman" w:hAnsi="Times New Roman" w:cs="Times New Roman"/>
+          <w:sz w:val="28"/>
+          <w:szCs w:val="28"/>
+        </w:rPr>
+        <w:t>«Конкретный запрос»</w:t>
+      </w:r>
+      <w:r>
+        <w:rPr>
+          <w:rStyle w:val="translatable-message"/>
+          <w:rFonts w:ascii="Times New Roman" w:hAnsi="Times New Roman" w:cs="Times New Roman"/>
+          <w:sz w:val="28"/>
+          <w:szCs w:val="28"/>
+        </w:rPr>
+        <w:t>.</w:t>
+      </w:r>
+      <w:r>
+        <w:rPr>
+          <w:rStyle w:val="translatable-message"/>
+          <w:rFonts w:ascii="Times New Roman" w:hAnsi="Times New Roman" w:cs="Times New Roman"/>
+          <w:sz w:val="28"/>
+          <w:szCs w:val="28"/>
+        </w:rPr>
+        <w:br/>
+        <w:t>- доделать админ панель;</w:t>
+      </w:r>
+      <w:r>
+        <w:rPr>
+          <w:rStyle w:val="translatable-message"/>
+          <w:rFonts w:ascii="Times New Roman" w:hAnsi="Times New Roman" w:cs="Times New Roman"/>
+          <w:sz w:val="28"/>
+          <w:szCs w:val="28"/>
+        </w:rPr>
+        <w:br/>
+        <w:t xml:space="preserve">- реализовать </w:t>
+      </w:r>
+      <w:r>
+        <w:rPr>
+          <w:rStyle w:val="translatable-message"/>
+          <w:rFonts w:ascii="Times New Roman" w:hAnsi="Times New Roman" w:cs="Times New Roman"/>
+          <w:sz w:val="28"/>
+          <w:szCs w:val="28"/>
+        </w:rPr>
+        <w:t xml:space="preserve"> </w:t>
+      </w:r>
+      <w:r>
+        <w:rPr>
+          <w:rStyle w:val="translatable-message"/>
+          <w:rFonts w:ascii="Times New Roman" w:hAnsi="Times New Roman" w:cs="Times New Roman"/>
+          <w:sz w:val="28"/>
+          <w:szCs w:val="28"/>
+        </w:rPr>
+        <w:t>сценарий редактирования обложки в редакторе изображений;</w:t>
+      </w:r>
+      <w:r>
+        <w:rPr>
+          <w:rStyle w:val="translatable-message"/>
+          <w:rFonts w:ascii="Times New Roman" w:hAnsi="Times New Roman" w:cs="Times New Roman"/>
+          <w:sz w:val="28"/>
+          <w:szCs w:val="28"/>
+        </w:rPr>
+        <w:br/>
+        <w:t>- покрыть тестами сценарии просмотр обложек и генерация;</w:t>
+      </w:r>
+      <w:r>
+        <w:rPr>
+          <w:rStyle w:val="translatable-message"/>
+          <w:rFonts w:ascii="Times New Roman" w:hAnsi="Times New Roman" w:cs="Times New Roman"/>
+          <w:sz w:val="28"/>
+          <w:szCs w:val="28"/>
+        </w:rPr>
+        <w:br/>
+        <w:t>- подключить систему сбора метрик.</w:t>
+      </w:r>
+    </w:p>
+    <w:p>
+      <w:pPr>
+        <w:spacing w:line="240" w:lineRule="auto"/>
+        <w:rPr>
+          <w:rStyle w:val="translatable-message"/>
+          <w:rFonts w:ascii="Times New Roman" w:hAnsi="Times New Roman" w:cs="Times New Roman"/>
+          <w:b/>
+          <w:sz w:val="28"/>
+          <w:szCs w:val="28"/>
+        </w:rPr>
+      </w:pPr>
+      <w:r>
+        <w:rPr>
+          <w:rStyle w:val="translatable-message"/>
+          <w:rFonts w:ascii="Times New Roman" w:hAnsi="Times New Roman" w:cs="Times New Roman"/>
+          <w:b/>
+          <w:sz w:val="28"/>
+          <w:szCs w:val="28"/>
+        </w:rPr>
+        <w:t xml:space="preserve">5. </w:t>
+      </w:r>
+      <w:r>
+        <w:rPr>
+          <w:rStyle w:val="translatable-message"/>
+          <w:rFonts w:ascii="Times New Roman" w:hAnsi="Times New Roman" w:cs="Times New Roman"/>
+          <w:b/>
+          <w:sz w:val="28"/>
+          <w:szCs w:val="28"/>
+        </w:rPr>
+        <w:t>Временные затраты участников.</w:t>
+      </w:r>
+    </w:p>
+    <w:p>
+      <w:pPr>
+        <w:spacing w:line="240" w:lineRule="auto"/>
+        <w:rPr>
+          <w:rStyle w:val="translatable-message"/>
+          <w:rFonts w:ascii="Times New Roman" w:hAnsi="Times New Roman" w:cs="Times New Roman"/>
+          <w:sz w:val="28"/>
+          <w:szCs w:val="28"/>
+        </w:rPr>
+      </w:pPr>
+      <w:r>
+        <w:rPr>
+          <w:rStyle w:val="translatable-message"/>
+          <w:rFonts w:ascii="Times New Roman" w:hAnsi="Times New Roman" w:cs="Times New Roman"/>
+          <w:sz w:val="28"/>
+          <w:szCs w:val="28"/>
+        </w:rPr>
+        <w:t>К предзащите было выполнено в общей сложности около 106 з</w:t>
+      </w:r>
+      <w:r>
+        <w:rPr>
+          <w:rStyle w:val="translatable-message"/>
+          <w:rFonts w:ascii="Times New Roman" w:hAnsi="Times New Roman" w:cs="Times New Roman"/>
+          <w:sz w:val="28"/>
+          <w:szCs w:val="28"/>
+        </w:rPr>
+        <w:t xml:space="preserve">адач. Список участников команды, </w:t>
+      </w:r>
+      <w:r>
+        <w:rPr>
+          <w:rStyle w:val="translatable-message"/>
+          <w:rFonts w:ascii="Times New Roman" w:hAnsi="Times New Roman" w:cs="Times New Roman"/>
+          <w:sz w:val="28"/>
+          <w:szCs w:val="28"/>
+        </w:rPr>
+        <w:t>примерное количество выполненных ими задач</w:t>
+      </w:r>
+      <w:r>
+        <w:rPr>
+          <w:rStyle w:val="translatable-message"/>
+          <w:rFonts w:ascii="Times New Roman" w:hAnsi="Times New Roman" w:cs="Times New Roman"/>
+          <w:sz w:val="28"/>
+          <w:szCs w:val="28"/>
+        </w:rPr>
+        <w:t xml:space="preserve"> и затраченное время на проект в долях от общего времени выполнения</w:t>
+      </w:r>
+      <w:r>
+        <w:rPr>
+          <w:rStyle w:val="translatable-message"/>
+          <w:rFonts w:ascii="Times New Roman" w:hAnsi="Times New Roman" w:cs="Times New Roman"/>
+          <w:sz w:val="28"/>
+          <w:szCs w:val="28"/>
+        </w:rPr>
+        <w:t>:</w:t>
+      </w:r>
+    </w:p>
+    <w:p>
+      <w:pPr>
+        <w:spacing w:line="240" w:lineRule="auto"/>
+        <w:rPr>
+          <w:rStyle w:val="translatable-message"/>
+          <w:rFonts w:ascii="Times New Roman" w:hAnsi="Times New Roman" w:cs="Times New Roman"/>
+          <w:sz w:val="28"/>
+          <w:szCs w:val="28"/>
+        </w:rPr>
+      </w:pPr>
+      <w:r>
+        <w:rPr>
+          <w:rStyle w:val="translatable-message"/>
+          <w:rFonts w:ascii="Times New Roman" w:hAnsi="Times New Roman" w:cs="Times New Roman"/>
+          <w:sz w:val="28"/>
+          <w:szCs w:val="28"/>
+        </w:rPr>
+        <w:t>Е. Белых</w:t>
+      </w:r>
+      <w:r>
+        <w:rPr>
+          <w:rStyle w:val="translatable-message"/>
+          <w:rFonts w:ascii="Times New Roman" w:hAnsi="Times New Roman" w:cs="Times New Roman"/>
+          <w:sz w:val="28"/>
+          <w:szCs w:val="28"/>
+        </w:rPr>
+        <w:tab/>
+      </w:r>
+      <w:r>
+        <w:rPr>
+          <w:rStyle w:val="translatable-message"/>
+          <w:rFonts w:ascii="Times New Roman" w:hAnsi="Times New Roman" w:cs="Times New Roman"/>
+          <w:sz w:val="28"/>
+          <w:szCs w:val="28"/>
+        </w:rPr>
+        <w:tab/>
+        <w:t>38</w:t>
+      </w:r>
+      <w:r>
+        <w:rPr>
+          <w:rStyle w:val="translatable-message"/>
+          <w:rFonts w:ascii="Times New Roman" w:hAnsi="Times New Roman" w:cs="Times New Roman"/>
+          <w:sz w:val="28"/>
+          <w:szCs w:val="28"/>
+        </w:rPr>
+        <w:tab/>
+        <w:t>35.8%</w:t>
+      </w:r>
+      <w:r>
+        <w:rPr>
+          <w:rStyle w:val="translatable-message"/>
+          <w:rFonts w:ascii="Times New Roman" w:hAnsi="Times New Roman" w:cs="Times New Roman"/>
+          <w:sz w:val="28"/>
+          <w:szCs w:val="28"/>
+        </w:rPr>
+        <w:br/>
+        <w:t>А. Липовцев</w:t>
+      </w:r>
+      <w:r>
+        <w:rPr>
+          <w:rStyle w:val="translatable-message"/>
+          <w:rFonts w:ascii="Times New Roman" w:hAnsi="Times New Roman" w:cs="Times New Roman"/>
+          <w:sz w:val="28"/>
+          <w:szCs w:val="28"/>
+        </w:rPr>
+        <w:tab/>
+        <w:t>16</w:t>
+      </w:r>
+      <w:r>
+        <w:rPr>
+          <w:rStyle w:val="translatable-message"/>
+          <w:rFonts w:ascii="Times New Roman" w:hAnsi="Times New Roman" w:cs="Times New Roman"/>
+          <w:sz w:val="28"/>
+          <w:szCs w:val="28"/>
+        </w:rPr>
+        <w:tab/>
+        <w:t>15.1%</w:t>
+      </w:r>
+      <w:r>
+        <w:rPr>
+          <w:rStyle w:val="translatable-message"/>
+          <w:rFonts w:ascii="Times New Roman" w:hAnsi="Times New Roman" w:cs="Times New Roman"/>
+          <w:sz w:val="28"/>
+          <w:szCs w:val="28"/>
+        </w:rPr>
+        <w:br/>
+        <w:t>А. Родионов</w:t>
+      </w:r>
+      <w:r>
+        <w:rPr>
+          <w:rStyle w:val="translatable-message"/>
+          <w:rFonts w:ascii="Times New Roman" w:hAnsi="Times New Roman" w:cs="Times New Roman"/>
+          <w:sz w:val="28"/>
+          <w:szCs w:val="28"/>
+        </w:rPr>
+        <w:tab/>
+        <w:t>16</w:t>
+      </w:r>
+      <w:r>
+        <w:rPr>
+          <w:rStyle w:val="translatable-message"/>
+          <w:rFonts w:ascii="Times New Roman" w:hAnsi="Times New Roman" w:cs="Times New Roman"/>
+          <w:sz w:val="28"/>
+          <w:szCs w:val="28"/>
+        </w:rPr>
+        <w:tab/>
+        <w:t>15.1%</w:t>
+      </w:r>
+      <w:r>
+        <w:rPr>
+          <w:rStyle w:val="translatable-message"/>
+          <w:rFonts w:ascii="Times New Roman" w:hAnsi="Times New Roman" w:cs="Times New Roman"/>
+          <w:sz w:val="28"/>
+          <w:szCs w:val="28"/>
+        </w:rPr>
+        <w:br/>
+        <w:t xml:space="preserve">Г. </w:t>
+      </w:r>
+      <w:r>
+        <w:rPr>
+          <w:rStyle w:val="translatable-message"/>
+          <w:rFonts w:ascii="Times New Roman" w:hAnsi="Times New Roman" w:cs="Times New Roman"/>
+          <w:sz w:val="28"/>
+          <w:szCs w:val="28"/>
+        </w:rPr>
+        <w:t>Тамбовцев</w:t>
+      </w:r>
+      <w:r>
+        <w:rPr>
+          <w:rStyle w:val="translatable-message"/>
+          <w:rFonts w:ascii="Times New Roman" w:hAnsi="Times New Roman" w:cs="Times New Roman"/>
+          <w:sz w:val="28"/>
+          <w:szCs w:val="28"/>
+        </w:rPr>
+        <w:tab/>
+        <w:t>9</w:t>
+      </w:r>
+      <w:r>
+        <w:rPr>
+          <w:rStyle w:val="translatable-message"/>
+          <w:rFonts w:ascii="Times New Roman" w:hAnsi="Times New Roman" w:cs="Times New Roman"/>
+          <w:sz w:val="28"/>
+          <w:szCs w:val="28"/>
+        </w:rPr>
+        <w:tab/>
+        <w:t>8.5%</w:t>
+      </w:r>
+      <w:r>
+        <w:rPr>
+          <w:rStyle w:val="translatable-message"/>
+          <w:rFonts w:ascii="Times New Roman" w:hAnsi="Times New Roman" w:cs="Times New Roman"/>
+          <w:sz w:val="28"/>
+          <w:szCs w:val="28"/>
+        </w:rPr>
+        <w:br/>
+        <w:t xml:space="preserve">И. </w:t>
+      </w:r>
+      <w:r>
+        <w:rPr>
+          <w:rStyle w:val="translatable-message"/>
+          <w:rFonts w:ascii="Times New Roman" w:hAnsi="Times New Roman" w:cs="Times New Roman"/>
+          <w:sz w:val="28"/>
+          <w:szCs w:val="28"/>
+        </w:rPr>
+        <w:t>Бажанов</w:t>
+      </w:r>
+      <w:r>
+        <w:rPr>
+          <w:rStyle w:val="translatable-message"/>
+          <w:rFonts w:ascii="Times New Roman" w:hAnsi="Times New Roman" w:cs="Times New Roman"/>
+          <w:sz w:val="28"/>
+          <w:szCs w:val="28"/>
+        </w:rPr>
+        <w:tab/>
+      </w:r>
+      <w:r>
+        <w:rPr>
+          <w:rStyle w:val="translatable-message"/>
+          <w:rFonts w:ascii="Times New Roman" w:hAnsi="Times New Roman" w:cs="Times New Roman"/>
+          <w:sz w:val="28"/>
+          <w:szCs w:val="28"/>
+        </w:rPr>
+        <w:tab/>
+        <w:t>16</w:t>
+      </w:r>
+      <w:r>
+        <w:rPr>
+          <w:rStyle w:val="translatable-message"/>
+          <w:rFonts w:ascii="Times New Roman" w:hAnsi="Times New Roman" w:cs="Times New Roman"/>
+          <w:sz w:val="28"/>
+          <w:szCs w:val="28"/>
+        </w:rPr>
+        <w:tab/>
+        <w:t>15.1%</w:t>
+      </w:r>
+      <w:r>
+        <w:rPr>
+          <w:rStyle w:val="translatable-message"/>
+          <w:rFonts w:ascii="Times New Roman" w:hAnsi="Times New Roman" w:cs="Times New Roman"/>
+          <w:sz w:val="28"/>
+          <w:szCs w:val="28"/>
+        </w:rPr>
+        <w:br/>
+        <w:t xml:space="preserve">Р. </w:t>
+      </w:r>
+      <w:proofErr w:type="spellStart"/>
+      <w:r>
+        <w:rPr>
+          <w:rStyle w:val="translatable-message"/>
+          <w:rFonts w:ascii="Times New Roman" w:hAnsi="Times New Roman" w:cs="Times New Roman"/>
+          <w:sz w:val="28"/>
+          <w:szCs w:val="28"/>
+        </w:rPr>
+        <w:t>Сейдалиев</w:t>
+      </w:r>
+      <w:proofErr w:type="spellEnd"/>
+      <w:r>
+        <w:rPr>
+          <w:rStyle w:val="translatable-message"/>
+          <w:rFonts w:ascii="Times New Roman" w:hAnsi="Times New Roman" w:cs="Times New Roman"/>
+          <w:sz w:val="28"/>
+          <w:szCs w:val="28"/>
+        </w:rPr>
+        <w:tab/>
+        <w:t>11</w:t>
+      </w:r>
+      <w:r>
+        <w:rPr>
+          <w:rStyle w:val="translatable-message"/>
+          <w:rFonts w:ascii="Times New Roman" w:hAnsi="Times New Roman" w:cs="Times New Roman"/>
+          <w:sz w:val="28"/>
+          <w:szCs w:val="28"/>
+        </w:rPr>
+        <w:tab/>
+        <w:t>10.4%</w:t>
+      </w:r>
+      <w:r>
+        <w:rPr>
+          <w:rStyle w:val="translatable-message"/>
+          <w:rFonts w:ascii="Times New Roman" w:hAnsi="Times New Roman" w:cs="Times New Roman"/>
+          <w:sz w:val="28"/>
+          <w:szCs w:val="28"/>
+        </w:rPr>
+        <w:br/>
+      </w:r>
       <w:bookmarkStart w:id="0" w:name="_GoBack"/>
       <w:bookmarkEnd w:id="0"/>
-    </w:p>
-    <w:p>
-      <w:pPr>
-        <w:spacing w:line="240" w:lineRule="auto"/>
-        <w:rPr>
-          <w:rStyle w:val="translatable-message"/>
-          <w:rFonts w:ascii="Times New Roman" w:hAnsi="Times New Roman" w:cs="Times New Roman"/>
-          <w:b/>
-          <w:sz w:val="28"/>
-          <w:szCs w:val="28"/>
-        </w:rPr>
-      </w:pPr>
-      <w:r>
-        <w:rPr>
-          <w:rStyle w:val="translatable-message"/>
-          <w:rFonts w:ascii="Times New Roman" w:hAnsi="Times New Roman" w:cs="Times New Roman"/>
-          <w:b/>
-          <w:sz w:val="28"/>
-          <w:szCs w:val="28"/>
-        </w:rPr>
-        <w:t>3. План на следующую неделю</w:t>
-      </w:r>
-    </w:p>
-    <w:p>
-      <w:pPr>
-        <w:spacing w:line="240" w:lineRule="auto"/>
-        <w:rPr>
-          <w:rStyle w:val="translatable-message"/>
-          <w:rFonts w:ascii="Times New Roman" w:hAnsi="Times New Roman" w:cs="Times New Roman"/>
-          <w:sz w:val="28"/>
-          <w:szCs w:val="28"/>
-        </w:rPr>
-      </w:pPr>
-      <w:r>
-        <w:rPr>
-          <w:rStyle w:val="translatable-message"/>
-          <w:rFonts w:ascii="Times New Roman" w:hAnsi="Times New Roman" w:cs="Times New Roman"/>
-          <w:sz w:val="28"/>
-          <w:szCs w:val="28"/>
-        </w:rPr>
-        <w:t>Приоритеты:</w:t>
-      </w:r>
-    </w:p>
-    <w:p>
-      <w:pPr>
-        <w:spacing w:line="240" w:lineRule="auto"/>
-        <w:rPr>
-          <w:rStyle w:val="translatable-message"/>
-          <w:rFonts w:ascii="Times New Roman" w:hAnsi="Times New Roman" w:cs="Times New Roman"/>
-          <w:sz w:val="28"/>
-          <w:szCs w:val="28"/>
-        </w:rPr>
-      </w:pPr>
-      <w:r>
-        <w:rPr>
-          <w:rStyle w:val="translatable-message"/>
-          <w:rFonts w:ascii="Times New Roman" w:hAnsi="Times New Roman" w:cs="Times New Roman"/>
-          <w:sz w:val="28"/>
-          <w:szCs w:val="28"/>
-        </w:rPr>
-        <w:t xml:space="preserve">- </w:t>
-      </w:r>
-      <w:r>
-        <w:rPr>
-          <w:rStyle w:val="translatable-message"/>
-          <w:rFonts w:ascii="Times New Roman" w:hAnsi="Times New Roman" w:cs="Times New Roman"/>
-          <w:sz w:val="28"/>
-          <w:szCs w:val="28"/>
-        </w:rPr>
-        <w:t xml:space="preserve">Реализовать </w:t>
-      </w:r>
-      <w:r>
-        <w:rPr>
-          <w:rStyle w:val="translatable-message"/>
-          <w:rFonts w:ascii="Times New Roman" w:hAnsi="Times New Roman" w:cs="Times New Roman"/>
-          <w:sz w:val="28"/>
-          <w:szCs w:val="28"/>
-        </w:rPr>
-        <w:t>пользовательский сценарий «Генерация»;</w:t>
-      </w:r>
-      <w:r>
-        <w:rPr>
-          <w:rStyle w:val="translatable-message"/>
-          <w:rFonts w:ascii="Times New Roman" w:hAnsi="Times New Roman" w:cs="Times New Roman"/>
-          <w:sz w:val="28"/>
-          <w:szCs w:val="28"/>
-        </w:rPr>
-        <w:t xml:space="preserve"> </w:t>
-      </w:r>
-      <w:r>
-        <w:rPr>
-          <w:rStyle w:val="translatable-message"/>
-          <w:rFonts w:ascii="Times New Roman" w:hAnsi="Times New Roman" w:cs="Times New Roman"/>
-          <w:sz w:val="28"/>
-          <w:szCs w:val="28"/>
-        </w:rPr>
-        <w:br/>
-        <w:t xml:space="preserve">- </w:t>
-      </w:r>
-      <w:r>
-        <w:rPr>
-          <w:rStyle w:val="translatable-message"/>
-          <w:rFonts w:ascii="Times New Roman" w:hAnsi="Times New Roman" w:cs="Times New Roman"/>
-          <w:sz w:val="28"/>
-          <w:szCs w:val="28"/>
-        </w:rPr>
-        <w:t xml:space="preserve">Доделать админ </w:t>
-      </w:r>
-      <w:proofErr w:type="gramStart"/>
-      <w:r>
-        <w:rPr>
-          <w:rStyle w:val="translatable-message"/>
-          <w:rFonts w:ascii="Times New Roman" w:hAnsi="Times New Roman" w:cs="Times New Roman"/>
-          <w:sz w:val="28"/>
-          <w:szCs w:val="28"/>
-        </w:rPr>
-        <w:t>панель</w:t>
-      </w:r>
-      <w:r>
-        <w:rPr>
-          <w:rStyle w:val="translatable-message"/>
-          <w:rFonts w:ascii="Times New Roman" w:hAnsi="Times New Roman" w:cs="Times New Roman"/>
-          <w:sz w:val="28"/>
-          <w:szCs w:val="28"/>
-        </w:rPr>
-        <w:t>;</w:t>
-      </w:r>
-      <w:r>
-        <w:rPr>
-          <w:rStyle w:val="translatable-message"/>
-          <w:rFonts w:ascii="Times New Roman" w:hAnsi="Times New Roman" w:cs="Times New Roman"/>
-          <w:sz w:val="28"/>
-          <w:szCs w:val="28"/>
-        </w:rPr>
-        <w:br/>
-      </w:r>
-      <w:r>
-        <w:rPr>
-          <w:rStyle w:val="translatable-message"/>
-          <w:rFonts w:ascii="Times New Roman" w:hAnsi="Times New Roman" w:cs="Times New Roman"/>
-          <w:sz w:val="28"/>
-          <w:szCs w:val="28"/>
-        </w:rPr>
-        <w:t>-</w:t>
-      </w:r>
-      <w:proofErr w:type="gramEnd"/>
-      <w:r>
-        <w:rPr>
-          <w:rStyle w:val="translatable-message"/>
-          <w:rFonts w:ascii="Times New Roman" w:hAnsi="Times New Roman" w:cs="Times New Roman"/>
-          <w:sz w:val="28"/>
-          <w:szCs w:val="28"/>
-        </w:rPr>
-        <w:t xml:space="preserve"> Покрыть юнит-тестами экраны регистрации и аутентификации;</w:t>
-      </w:r>
-      <w:r>
-        <w:rPr>
-          <w:rStyle w:val="translatable-message"/>
-          <w:rFonts w:ascii="Times New Roman" w:hAnsi="Times New Roman" w:cs="Times New Roman"/>
-          <w:sz w:val="28"/>
-          <w:szCs w:val="28"/>
-        </w:rPr>
-        <w:br/>
-        <w:t>- Связать админ панель с базой данных</w:t>
-      </w:r>
-      <w:r>
-        <w:rPr>
-          <w:rStyle w:val="translatable-message"/>
-          <w:rFonts w:ascii="Times New Roman" w:hAnsi="Times New Roman" w:cs="Times New Roman"/>
-          <w:sz w:val="28"/>
-          <w:szCs w:val="28"/>
-        </w:rPr>
-        <w:t xml:space="preserve"> пользователей</w:t>
-      </w:r>
-      <w:r>
-        <w:rPr>
-          <w:rStyle w:val="translatable-message"/>
-          <w:rFonts w:ascii="Times New Roman" w:hAnsi="Times New Roman" w:cs="Times New Roman"/>
-          <w:sz w:val="28"/>
-          <w:szCs w:val="28"/>
-        </w:rPr>
-        <w:t>.</w:t>
-      </w:r>
-    </w:p>
-    <w:p>
-      <w:pPr>
-        <w:spacing w:line="240" w:lineRule="auto"/>
-        <w:rPr>
-          <w:rStyle w:val="translatable-message"/>
-          <w:rFonts w:ascii="Times New Roman" w:hAnsi="Times New Roman" w:cs="Times New Roman"/>
-          <w:sz w:val="28"/>
-          <w:szCs w:val="28"/>
-        </w:rPr>
-      </w:pPr>
-      <w:r>
-        <w:rPr>
-          <w:rStyle w:val="translatable-message"/>
-          <w:rFonts w:ascii="Times New Roman" w:hAnsi="Times New Roman" w:cs="Times New Roman"/>
-          <w:b/>
-          <w:sz w:val="28"/>
-          <w:szCs w:val="28"/>
-        </w:rPr>
-        <w:t>Метрики контроля</w:t>
-      </w:r>
-    </w:p>
-    <w:p>
-      <w:pPr>
-        <w:spacing w:line="240" w:lineRule="auto"/>
-        <w:rPr>
-          <w:rStyle w:val="translatable-message"/>
-          <w:rFonts w:ascii="Times New Roman" w:hAnsi="Times New Roman" w:cs="Times New Roman"/>
-          <w:sz w:val="28"/>
-          <w:szCs w:val="28"/>
-        </w:rPr>
-      </w:pPr>
-      <w:r>
-        <w:rPr>
-          <w:rStyle w:val="translatable-message"/>
-          <w:rFonts w:ascii="Times New Roman" w:hAnsi="Times New Roman" w:cs="Times New Roman"/>
-          <w:sz w:val="28"/>
-          <w:szCs w:val="28"/>
-        </w:rPr>
-        <w:lastRenderedPageBreak/>
-        <w:t xml:space="preserve">- </w:t>
-      </w:r>
-      <w:r>
-        <w:rPr>
-          <w:rStyle w:val="translatable-message"/>
-          <w:rFonts w:ascii="Times New Roman" w:hAnsi="Times New Roman" w:cs="Times New Roman"/>
-          <w:sz w:val="28"/>
-          <w:szCs w:val="28"/>
-        </w:rPr>
-        <w:t>Создание рабоч</w:t>
-      </w:r>
-      <w:r>
-        <w:rPr>
-          <w:rStyle w:val="translatable-message"/>
-          <w:rFonts w:ascii="Times New Roman" w:hAnsi="Times New Roman" w:cs="Times New Roman"/>
-          <w:sz w:val="28"/>
-          <w:szCs w:val="28"/>
-        </w:rPr>
-        <w:t>их</w:t>
-      </w:r>
-      <w:r>
-        <w:rPr>
-          <w:rStyle w:val="translatable-message"/>
-          <w:rFonts w:ascii="Times New Roman" w:hAnsi="Times New Roman" w:cs="Times New Roman"/>
-          <w:sz w:val="28"/>
-          <w:szCs w:val="28"/>
-        </w:rPr>
-        <w:t xml:space="preserve"> </w:t>
-      </w:r>
-      <w:r>
-        <w:rPr>
-          <w:rStyle w:val="translatable-message"/>
-          <w:rFonts w:ascii="Times New Roman" w:hAnsi="Times New Roman" w:cs="Times New Roman"/>
-          <w:sz w:val="28"/>
-          <w:szCs w:val="28"/>
-        </w:rPr>
-        <w:t>сценари</w:t>
-      </w:r>
-      <w:r>
-        <w:rPr>
-          <w:rStyle w:val="translatable-message"/>
-          <w:rFonts w:ascii="Times New Roman" w:hAnsi="Times New Roman" w:cs="Times New Roman"/>
-          <w:sz w:val="28"/>
-          <w:szCs w:val="28"/>
-        </w:rPr>
-        <w:t>ев «Просмотр обложек» и «</w:t>
-      </w:r>
-      <w:r>
-        <w:rPr>
-          <w:rStyle w:val="translatable-message"/>
-          <w:rFonts w:ascii="Times New Roman" w:hAnsi="Times New Roman" w:cs="Times New Roman"/>
-          <w:sz w:val="28"/>
-          <w:szCs w:val="28"/>
-        </w:rPr>
-        <w:t xml:space="preserve">Генерация обложек» к 24.05.2025 не было реализовано, так как </w:t>
-      </w:r>
-      <w:r>
-        <w:rPr>
-          <w:rStyle w:val="translatable-message"/>
-          <w:rFonts w:ascii="Times New Roman" w:hAnsi="Times New Roman" w:cs="Times New Roman"/>
-          <w:sz w:val="28"/>
-          <w:szCs w:val="28"/>
-          <w:lang w:val="en-US"/>
-        </w:rPr>
-        <w:t>backend</w:t>
-      </w:r>
-      <w:r>
-        <w:rPr>
-          <w:rStyle w:val="translatable-message"/>
-          <w:rFonts w:ascii="Times New Roman" w:hAnsi="Times New Roman" w:cs="Times New Roman"/>
-          <w:sz w:val="28"/>
-          <w:szCs w:val="28"/>
-        </w:rPr>
-        <w:t>-разработчику потребовалось больше времени на реализацию сцена</w:t>
-      </w:r>
-      <w:r>
-        <w:rPr>
-          <w:rStyle w:val="translatable-message"/>
-          <w:rFonts w:ascii="Times New Roman" w:hAnsi="Times New Roman" w:cs="Times New Roman"/>
-          <w:sz w:val="28"/>
-          <w:szCs w:val="28"/>
-        </w:rPr>
-        <w:t>риев, связанных с просмотром обложек. К 26.05.2025 сценарий «Генерация обложек» будет работать на Мок-данных</w:t>
-      </w:r>
-    </w:p>
-    <w:p>
-      <w:pPr>
-        <w:spacing w:line="240" w:lineRule="auto"/>
-        <w:rPr>
-          <w:rStyle w:val="translatable-message"/>
-          <w:rFonts w:ascii="Times New Roman" w:hAnsi="Times New Roman" w:cs="Times New Roman"/>
-          <w:sz w:val="28"/>
-          <w:szCs w:val="28"/>
-        </w:rPr>
-      </w:pPr>
-      <w:r>
-        <w:rPr>
-          <w:rStyle w:val="translatable-message"/>
-          <w:rFonts w:ascii="Times New Roman" w:hAnsi="Times New Roman" w:cs="Times New Roman"/>
-          <w:sz w:val="28"/>
-          <w:szCs w:val="28"/>
-        </w:rPr>
-        <w:t>- Полноценная реализация сценариев генерации должна быть реализована к 31.05.2025.</w:t>
-      </w:r>
-      <w:r>
-        <w:rPr>
-          <w:rStyle w:val="translatable-message"/>
-          <w:rFonts w:ascii="Times New Roman" w:hAnsi="Times New Roman" w:cs="Times New Roman"/>
-          <w:sz w:val="28"/>
-          <w:szCs w:val="28"/>
-        </w:rPr>
-        <w:br/>
-      </w:r>
-    </w:p>
-    <w:p>
-      <w:pPr>
-        <w:spacing w:line="240" w:lineRule="auto"/>
-        <w:rPr>
-          <w:rStyle w:val="translatable-message"/>
-          <w:rFonts w:ascii="Times New Roman" w:hAnsi="Times New Roman" w:cs="Times New Roman"/>
-          <w:b/>
-          <w:sz w:val="28"/>
-          <w:szCs w:val="28"/>
-        </w:rPr>
-      </w:pPr>
-      <w:r>
-        <w:rPr>
-          <w:rStyle w:val="translatable-message"/>
-          <w:rFonts w:ascii="Times New Roman" w:hAnsi="Times New Roman" w:cs="Times New Roman"/>
-          <w:b/>
-          <w:sz w:val="28"/>
-          <w:szCs w:val="28"/>
-        </w:rPr>
-        <w:t>4</w:t>
-      </w:r>
-      <w:r>
-        <w:rPr>
-          <w:rStyle w:val="translatable-message"/>
-          <w:rFonts w:ascii="Times New Roman" w:hAnsi="Times New Roman" w:cs="Times New Roman"/>
-          <w:b/>
-          <w:sz w:val="28"/>
-          <w:szCs w:val="28"/>
-        </w:rPr>
-        <w:t>. Заключение PM</w:t>
-      </w:r>
-    </w:p>
-    <w:p>
-      <w:pPr>
-        <w:spacing w:line="240" w:lineRule="auto"/>
-        <w:rPr>
-          <w:rStyle w:val="translatable-message"/>
-          <w:rFonts w:ascii="Times New Roman" w:hAnsi="Times New Roman" w:cs="Times New Roman"/>
-          <w:sz w:val="28"/>
-          <w:szCs w:val="28"/>
-        </w:rPr>
-      </w:pPr>
-      <w:r>
-        <w:rPr>
-          <w:rStyle w:val="translatable-message"/>
-          <w:rFonts w:ascii="Times New Roman" w:hAnsi="Times New Roman" w:cs="Times New Roman"/>
-          <w:sz w:val="28"/>
-          <w:szCs w:val="28"/>
-        </w:rPr>
-        <w:t xml:space="preserve">Проект </w:t>
-      </w:r>
-      <w:r>
-        <w:rPr>
-          <w:rStyle w:val="translatable-message"/>
-          <w:rFonts w:ascii="Times New Roman" w:hAnsi="Times New Roman" w:cs="Times New Roman"/>
-          <w:sz w:val="28"/>
-          <w:szCs w:val="28"/>
-        </w:rPr>
-        <w:t>отстает от плана. Т</w:t>
-      </w:r>
-      <w:r>
-        <w:rPr>
-          <w:rStyle w:val="translatable-message"/>
-          <w:rFonts w:ascii="Times New Roman" w:hAnsi="Times New Roman" w:cs="Times New Roman"/>
-          <w:sz w:val="28"/>
-          <w:szCs w:val="28"/>
-        </w:rPr>
-        <w:t>ребуе</w:t>
-      </w:r>
-      <w:r>
-        <w:rPr>
-          <w:rStyle w:val="translatable-message"/>
-          <w:rFonts w:ascii="Times New Roman" w:hAnsi="Times New Roman" w:cs="Times New Roman"/>
-          <w:sz w:val="28"/>
-          <w:szCs w:val="28"/>
-        </w:rPr>
-        <w:t>т</w:t>
-      </w:r>
-      <w:r>
-        <w:rPr>
-          <w:rStyle w:val="translatable-message"/>
-          <w:rFonts w:ascii="Times New Roman" w:hAnsi="Times New Roman" w:cs="Times New Roman"/>
-          <w:sz w:val="28"/>
-          <w:szCs w:val="28"/>
-        </w:rPr>
-        <w:t>ся</w:t>
-      </w:r>
-      <w:r>
-        <w:rPr>
-          <w:rStyle w:val="translatable-message"/>
-          <w:rFonts w:ascii="Times New Roman" w:hAnsi="Times New Roman" w:cs="Times New Roman"/>
-          <w:sz w:val="28"/>
-          <w:szCs w:val="28"/>
-        </w:rPr>
-        <w:t xml:space="preserve"> ускорени</w:t>
-      </w:r>
-      <w:r>
-        <w:rPr>
-          <w:rStyle w:val="translatable-message"/>
-          <w:rFonts w:ascii="Times New Roman" w:hAnsi="Times New Roman" w:cs="Times New Roman"/>
-          <w:sz w:val="28"/>
-          <w:szCs w:val="28"/>
-        </w:rPr>
-        <w:t>е</w:t>
-      </w:r>
-      <w:r>
-        <w:rPr>
-          <w:rStyle w:val="translatable-message"/>
-          <w:rFonts w:ascii="Times New Roman" w:hAnsi="Times New Roman" w:cs="Times New Roman"/>
-          <w:sz w:val="28"/>
-          <w:szCs w:val="28"/>
-        </w:rPr>
-        <w:t xml:space="preserve"> работы над </w:t>
-      </w:r>
-      <w:proofErr w:type="spellStart"/>
-      <w:r>
-        <w:rPr>
-          <w:rStyle w:val="translatable-message"/>
-          <w:rFonts w:ascii="Times New Roman" w:hAnsi="Times New Roman" w:cs="Times New Roman"/>
-          <w:sz w:val="28"/>
-          <w:szCs w:val="28"/>
-        </w:rPr>
-        <w:t>бэкенд</w:t>
-      </w:r>
-      <w:proofErr w:type="spellEnd"/>
-      <w:r>
-        <w:rPr>
-          <w:rStyle w:val="translatable-message"/>
-          <w:rFonts w:ascii="Times New Roman" w:hAnsi="Times New Roman" w:cs="Times New Roman"/>
-          <w:sz w:val="28"/>
-          <w:szCs w:val="28"/>
-        </w:rPr>
-        <w:t>-частью</w:t>
-      </w:r>
-      <w:r>
-        <w:rPr>
-          <w:rStyle w:val="translatable-message"/>
-          <w:rFonts w:ascii="Times New Roman" w:hAnsi="Times New Roman" w:cs="Times New Roman"/>
-          <w:sz w:val="28"/>
-          <w:szCs w:val="28"/>
-        </w:rPr>
-        <w:t>, внедрением аналитики и покрытием тестами основных пользовательских сценариев.</w:t>
-      </w:r>
-    </w:p>
-    <w:p>
-      <w:pPr>
-        <w:spacing w:line="240" w:lineRule="auto"/>
-        <w:rPr>
-          <w:rStyle w:val="translatable-message"/>
-          <w:rFonts w:ascii="Times New Roman" w:hAnsi="Times New Roman" w:cs="Times New Roman"/>
-          <w:sz w:val="28"/>
-          <w:szCs w:val="28"/>
-        </w:rPr>
-      </w:pPr>
-      <w:r>
-        <w:rPr>
-          <w:rStyle w:val="translatable-message"/>
-          <w:rFonts w:ascii="Times New Roman" w:hAnsi="Times New Roman" w:cs="Times New Roman"/>
-          <w:sz w:val="28"/>
-          <w:szCs w:val="28"/>
-        </w:rPr>
-        <w:t xml:space="preserve">К предзащите </w:t>
-      </w:r>
-      <w:proofErr w:type="gramStart"/>
-      <w:r>
-        <w:rPr>
-          <w:rStyle w:val="translatable-message"/>
-          <w:rFonts w:ascii="Times New Roman" w:hAnsi="Times New Roman" w:cs="Times New Roman"/>
-          <w:sz w:val="28"/>
-          <w:szCs w:val="28"/>
-        </w:rPr>
-        <w:t>готово:</w:t>
-      </w:r>
-      <w:r>
-        <w:rPr>
-          <w:rStyle w:val="translatable-message"/>
-          <w:rFonts w:ascii="Times New Roman" w:hAnsi="Times New Roman" w:cs="Times New Roman"/>
-          <w:sz w:val="28"/>
-          <w:szCs w:val="28"/>
-        </w:rPr>
-        <w:br/>
-        <w:t>-</w:t>
-      </w:r>
-      <w:proofErr w:type="gramEnd"/>
-      <w:r>
-        <w:rPr>
-          <w:rStyle w:val="translatable-message"/>
-          <w:rFonts w:ascii="Times New Roman" w:hAnsi="Times New Roman" w:cs="Times New Roman"/>
-          <w:sz w:val="28"/>
-          <w:szCs w:val="28"/>
-        </w:rPr>
-        <w:t xml:space="preserve"> завершен </w:t>
-      </w:r>
-      <w:r>
-        <w:rPr>
-          <w:rStyle w:val="translatable-message"/>
-          <w:rFonts w:ascii="Times New Roman" w:hAnsi="Times New Roman" w:cs="Times New Roman"/>
-          <w:sz w:val="28"/>
-          <w:szCs w:val="28"/>
-          <w:lang w:val="en-US"/>
-        </w:rPr>
-        <w:t>UI</w:t>
-      </w:r>
-      <w:r>
-        <w:rPr>
-          <w:rStyle w:val="translatable-message"/>
-          <w:rFonts w:ascii="Times New Roman" w:hAnsi="Times New Roman" w:cs="Times New Roman"/>
-          <w:sz w:val="28"/>
-          <w:szCs w:val="28"/>
-        </w:rPr>
-        <w:t xml:space="preserve">-дизайн в соответствии с макетами </w:t>
-      </w:r>
-      <w:proofErr w:type="spellStart"/>
-      <w:r>
-        <w:rPr>
-          <w:rStyle w:val="translatable-message"/>
-          <w:rFonts w:ascii="Times New Roman" w:hAnsi="Times New Roman" w:cs="Times New Roman"/>
-          <w:sz w:val="28"/>
-          <w:szCs w:val="28"/>
-          <w:lang w:val="en-US"/>
-        </w:rPr>
-        <w:t>Figma</w:t>
-      </w:r>
-      <w:proofErr w:type="spellEnd"/>
-      <w:r>
-        <w:rPr>
-          <w:rStyle w:val="translatable-message"/>
-          <w:rFonts w:ascii="Times New Roman" w:hAnsi="Times New Roman" w:cs="Times New Roman"/>
-          <w:sz w:val="28"/>
-          <w:szCs w:val="28"/>
-        </w:rPr>
-        <w:t>;</w:t>
-      </w:r>
-      <w:r>
-        <w:rPr>
-          <w:rStyle w:val="translatable-message"/>
-          <w:rFonts w:ascii="Times New Roman" w:hAnsi="Times New Roman" w:cs="Times New Roman"/>
-          <w:sz w:val="28"/>
-          <w:szCs w:val="28"/>
-        </w:rPr>
-        <w:br/>
-        <w:t>-</w:t>
-      </w:r>
-      <w:r>
-        <w:rPr>
-          <w:rStyle w:val="translatable-message"/>
-          <w:rFonts w:ascii="Times New Roman" w:hAnsi="Times New Roman" w:cs="Times New Roman"/>
-          <w:sz w:val="28"/>
-          <w:szCs w:val="28"/>
-        </w:rPr>
-        <w:t xml:space="preserve"> </w:t>
-      </w:r>
-      <w:r>
-        <w:rPr>
-          <w:rStyle w:val="translatable-message"/>
-          <w:rFonts w:ascii="Times New Roman" w:hAnsi="Times New Roman" w:cs="Times New Roman"/>
-          <w:sz w:val="28"/>
-          <w:szCs w:val="28"/>
-        </w:rPr>
-        <w:t xml:space="preserve">сверстаны все экраны </w:t>
-      </w:r>
-      <w:r>
-        <w:rPr>
-          <w:rStyle w:val="translatable-message"/>
-          <w:rFonts w:ascii="Times New Roman" w:hAnsi="Times New Roman" w:cs="Times New Roman"/>
-          <w:sz w:val="28"/>
-          <w:szCs w:val="28"/>
-          <w:lang w:val="en-US"/>
-        </w:rPr>
-        <w:t>android</w:t>
-      </w:r>
-      <w:r>
-        <w:rPr>
-          <w:rStyle w:val="translatable-message"/>
-          <w:rFonts w:ascii="Times New Roman" w:hAnsi="Times New Roman" w:cs="Times New Roman"/>
-          <w:sz w:val="28"/>
-          <w:szCs w:val="28"/>
-        </w:rPr>
-        <w:t>-</w:t>
-      </w:r>
-      <w:r>
-        <w:rPr>
-          <w:rStyle w:val="translatable-message"/>
-          <w:rFonts w:ascii="Times New Roman" w:hAnsi="Times New Roman" w:cs="Times New Roman"/>
-          <w:sz w:val="28"/>
-          <w:szCs w:val="28"/>
-        </w:rPr>
-        <w:t>приложения</w:t>
-      </w:r>
-      <w:r>
-        <w:rPr>
-          <w:rStyle w:val="translatable-message"/>
-          <w:rFonts w:ascii="Times New Roman" w:hAnsi="Times New Roman" w:cs="Times New Roman"/>
-          <w:sz w:val="28"/>
-          <w:szCs w:val="28"/>
-        </w:rPr>
-        <w:t>;</w:t>
-      </w:r>
-      <w:r>
-        <w:rPr>
-          <w:rStyle w:val="translatable-message"/>
-          <w:rFonts w:ascii="Times New Roman" w:hAnsi="Times New Roman" w:cs="Times New Roman"/>
-          <w:sz w:val="28"/>
-          <w:szCs w:val="28"/>
-        </w:rPr>
-        <w:br/>
-        <w:t>-</w:t>
-      </w:r>
-      <w:r>
-        <w:rPr>
-          <w:rStyle w:val="translatable-message"/>
-          <w:rFonts w:ascii="Times New Roman" w:hAnsi="Times New Roman" w:cs="Times New Roman"/>
-          <w:sz w:val="28"/>
-          <w:szCs w:val="28"/>
-        </w:rPr>
-        <w:t xml:space="preserve"> </w:t>
-      </w:r>
-      <w:r>
-        <w:rPr>
-          <w:rStyle w:val="translatable-message"/>
-          <w:rFonts w:ascii="Times New Roman" w:hAnsi="Times New Roman" w:cs="Times New Roman"/>
-          <w:sz w:val="28"/>
-          <w:szCs w:val="28"/>
-        </w:rPr>
-        <w:t xml:space="preserve">реализованы сценарии </w:t>
-      </w:r>
-      <w:r>
-        <w:rPr>
-          <w:rStyle w:val="translatable-message"/>
-          <w:rFonts w:ascii="Times New Roman" w:hAnsi="Times New Roman" w:cs="Times New Roman"/>
-          <w:sz w:val="28"/>
-          <w:szCs w:val="28"/>
-        </w:rPr>
-        <w:t>«</w:t>
-      </w:r>
-      <w:r>
-        <w:rPr>
-          <w:rStyle w:val="translatable-message"/>
-          <w:rFonts w:ascii="Times New Roman" w:hAnsi="Times New Roman" w:cs="Times New Roman"/>
-          <w:sz w:val="28"/>
-          <w:szCs w:val="28"/>
-        </w:rPr>
-        <w:t>авторизация</w:t>
-      </w:r>
-      <w:r>
-        <w:rPr>
-          <w:rStyle w:val="translatable-message"/>
-          <w:rFonts w:ascii="Times New Roman" w:hAnsi="Times New Roman" w:cs="Times New Roman"/>
-          <w:sz w:val="28"/>
-          <w:szCs w:val="28"/>
-        </w:rPr>
-        <w:t>»</w:t>
-      </w:r>
-      <w:r>
-        <w:rPr>
-          <w:rStyle w:val="translatable-message"/>
-          <w:rFonts w:ascii="Times New Roman" w:hAnsi="Times New Roman" w:cs="Times New Roman"/>
-          <w:sz w:val="28"/>
-          <w:szCs w:val="28"/>
-        </w:rPr>
-        <w:t xml:space="preserve">, </w:t>
-      </w:r>
-      <w:r>
-        <w:rPr>
-          <w:rStyle w:val="translatable-message"/>
-          <w:rFonts w:ascii="Times New Roman" w:hAnsi="Times New Roman" w:cs="Times New Roman"/>
-          <w:sz w:val="28"/>
-          <w:szCs w:val="28"/>
-        </w:rPr>
-        <w:t>«</w:t>
-      </w:r>
-      <w:r>
-        <w:rPr>
-          <w:rStyle w:val="translatable-message"/>
-          <w:rFonts w:ascii="Times New Roman" w:hAnsi="Times New Roman" w:cs="Times New Roman"/>
-          <w:sz w:val="28"/>
-          <w:szCs w:val="28"/>
-        </w:rPr>
-        <w:t>регистрация</w:t>
-      </w:r>
-      <w:r>
-        <w:rPr>
-          <w:rStyle w:val="translatable-message"/>
-          <w:rFonts w:ascii="Times New Roman" w:hAnsi="Times New Roman" w:cs="Times New Roman"/>
-          <w:sz w:val="28"/>
-          <w:szCs w:val="28"/>
-        </w:rPr>
-        <w:t>»</w:t>
-      </w:r>
-      <w:r>
-        <w:rPr>
-          <w:rStyle w:val="translatable-message"/>
-          <w:rFonts w:ascii="Times New Roman" w:hAnsi="Times New Roman" w:cs="Times New Roman"/>
-          <w:sz w:val="28"/>
-          <w:szCs w:val="28"/>
-        </w:rPr>
-        <w:t xml:space="preserve">, </w:t>
-      </w:r>
-      <w:r>
-        <w:rPr>
-          <w:rStyle w:val="translatable-message"/>
-          <w:rFonts w:ascii="Times New Roman" w:hAnsi="Times New Roman" w:cs="Times New Roman"/>
-          <w:sz w:val="28"/>
-          <w:szCs w:val="28"/>
-        </w:rPr>
-        <w:t>«</w:t>
-      </w:r>
-      <w:r>
-        <w:rPr>
-          <w:rStyle w:val="translatable-message"/>
-          <w:rFonts w:ascii="Times New Roman" w:hAnsi="Times New Roman" w:cs="Times New Roman"/>
-          <w:sz w:val="28"/>
-          <w:szCs w:val="28"/>
-        </w:rPr>
-        <w:t>просмотр обложек</w:t>
-      </w:r>
-      <w:r>
-        <w:rPr>
-          <w:rStyle w:val="translatable-message"/>
-          <w:rFonts w:ascii="Times New Roman" w:hAnsi="Times New Roman" w:cs="Times New Roman"/>
-          <w:sz w:val="28"/>
-          <w:szCs w:val="28"/>
-        </w:rPr>
-        <w:t>»</w:t>
-      </w:r>
-      <w:r>
-        <w:rPr>
-          <w:rStyle w:val="translatable-message"/>
-          <w:rFonts w:ascii="Times New Roman" w:hAnsi="Times New Roman" w:cs="Times New Roman"/>
-          <w:sz w:val="28"/>
-          <w:szCs w:val="28"/>
-        </w:rPr>
-        <w:t>;</w:t>
-      </w:r>
-      <w:r>
-        <w:rPr>
-          <w:rStyle w:val="translatable-message"/>
-          <w:rFonts w:ascii="Times New Roman" w:hAnsi="Times New Roman" w:cs="Times New Roman"/>
-          <w:sz w:val="28"/>
-          <w:szCs w:val="28"/>
-        </w:rPr>
-        <w:br/>
-        <w:t xml:space="preserve">- </w:t>
-      </w:r>
-      <w:r>
-        <w:rPr>
-          <w:rStyle w:val="translatable-message"/>
-          <w:rFonts w:ascii="Times New Roman" w:hAnsi="Times New Roman" w:cs="Times New Roman"/>
-          <w:sz w:val="28"/>
-          <w:szCs w:val="28"/>
-        </w:rPr>
-        <w:t>сверстана админ панель.</w:t>
-      </w:r>
-    </w:p>
-    <w:p>
-      <w:pPr>
-        <w:spacing w:line="240" w:lineRule="auto"/>
-        <w:rPr>
-          <w:rStyle w:val="translatable-message"/>
-          <w:rFonts w:ascii="Times New Roman" w:hAnsi="Times New Roman" w:cs="Times New Roman"/>
-          <w:sz w:val="28"/>
-          <w:szCs w:val="28"/>
-        </w:rPr>
-      </w:pPr>
-      <w:r>
-        <w:rPr>
-          <w:rStyle w:val="translatable-message"/>
-          <w:rFonts w:ascii="Times New Roman" w:hAnsi="Times New Roman" w:cs="Times New Roman"/>
-          <w:sz w:val="28"/>
-          <w:szCs w:val="28"/>
-        </w:rPr>
-        <w:t xml:space="preserve">Оставшиеся доработки перед финальной </w:t>
-      </w:r>
-      <w:proofErr w:type="gramStart"/>
-      <w:r>
-        <w:rPr>
-          <w:rStyle w:val="translatable-message"/>
-          <w:rFonts w:ascii="Times New Roman" w:hAnsi="Times New Roman" w:cs="Times New Roman"/>
-          <w:sz w:val="28"/>
-          <w:szCs w:val="28"/>
-        </w:rPr>
-        <w:t>защитой:</w:t>
-      </w:r>
-      <w:r>
-        <w:rPr>
-          <w:rStyle w:val="translatable-message"/>
-          <w:rFonts w:ascii="Times New Roman" w:hAnsi="Times New Roman" w:cs="Times New Roman"/>
-          <w:sz w:val="28"/>
-          <w:szCs w:val="28"/>
-        </w:rPr>
-        <w:br/>
-        <w:t>-</w:t>
-      </w:r>
-      <w:proofErr w:type="gramEnd"/>
-      <w:r>
-        <w:rPr>
-          <w:rStyle w:val="translatable-message"/>
-          <w:rFonts w:ascii="Times New Roman" w:hAnsi="Times New Roman" w:cs="Times New Roman"/>
-          <w:sz w:val="28"/>
-          <w:szCs w:val="28"/>
-        </w:rPr>
-        <w:t xml:space="preserve"> реализовать </w:t>
-      </w:r>
-      <w:r>
-        <w:rPr>
-          <w:rStyle w:val="translatable-message"/>
-          <w:rFonts w:ascii="Times New Roman" w:hAnsi="Times New Roman" w:cs="Times New Roman"/>
-          <w:sz w:val="28"/>
-          <w:szCs w:val="28"/>
-        </w:rPr>
-        <w:t>сценарии</w:t>
-      </w:r>
-      <w:r>
-        <w:rPr>
-          <w:rStyle w:val="translatable-message"/>
-          <w:rFonts w:ascii="Times New Roman" w:hAnsi="Times New Roman" w:cs="Times New Roman"/>
-          <w:sz w:val="28"/>
-          <w:szCs w:val="28"/>
-        </w:rPr>
-        <w:t xml:space="preserve"> генераци</w:t>
-      </w:r>
-      <w:r>
-        <w:rPr>
-          <w:rStyle w:val="translatable-message"/>
-          <w:rFonts w:ascii="Times New Roman" w:hAnsi="Times New Roman" w:cs="Times New Roman"/>
-          <w:sz w:val="28"/>
-          <w:szCs w:val="28"/>
-        </w:rPr>
-        <w:t>и в режимах «Автоматический режим»</w:t>
-      </w:r>
-      <w:r>
-        <w:rPr>
-          <w:rStyle w:val="translatable-message"/>
-          <w:rFonts w:ascii="Times New Roman" w:hAnsi="Times New Roman" w:cs="Times New Roman"/>
-          <w:sz w:val="28"/>
-          <w:szCs w:val="28"/>
-        </w:rPr>
-        <w:t>,</w:t>
-      </w:r>
-      <w:r>
-        <w:rPr>
-          <w:rStyle w:val="translatable-message"/>
-          <w:rFonts w:ascii="Times New Roman" w:hAnsi="Times New Roman" w:cs="Times New Roman"/>
-          <w:sz w:val="28"/>
-          <w:szCs w:val="28"/>
-        </w:rPr>
-        <w:t xml:space="preserve"> </w:t>
-      </w:r>
-      <w:r>
-        <w:rPr>
-          <w:rStyle w:val="translatable-message"/>
-          <w:rFonts w:ascii="Times New Roman" w:hAnsi="Times New Roman" w:cs="Times New Roman"/>
-          <w:sz w:val="28"/>
-          <w:szCs w:val="28"/>
-        </w:rPr>
-        <w:t>«Детальная настройка»</w:t>
-      </w:r>
-      <w:r>
-        <w:rPr>
-          <w:rStyle w:val="translatable-message"/>
-          <w:rFonts w:ascii="Times New Roman" w:hAnsi="Times New Roman" w:cs="Times New Roman"/>
-          <w:sz w:val="28"/>
-          <w:szCs w:val="28"/>
-        </w:rPr>
-        <w:t xml:space="preserve">, </w:t>
-      </w:r>
-      <w:r>
-        <w:rPr>
-          <w:rStyle w:val="translatable-message"/>
-          <w:rFonts w:ascii="Times New Roman" w:hAnsi="Times New Roman" w:cs="Times New Roman"/>
-          <w:sz w:val="28"/>
-          <w:szCs w:val="28"/>
-        </w:rPr>
-        <w:t>«Конкретный запрос»</w:t>
-      </w:r>
-      <w:r>
-        <w:rPr>
-          <w:rStyle w:val="translatable-message"/>
-          <w:rFonts w:ascii="Times New Roman" w:hAnsi="Times New Roman" w:cs="Times New Roman"/>
-          <w:sz w:val="28"/>
-          <w:szCs w:val="28"/>
-        </w:rPr>
-        <w:t>.</w:t>
-      </w:r>
-      <w:r>
-        <w:rPr>
-          <w:rStyle w:val="translatable-message"/>
-          <w:rFonts w:ascii="Times New Roman" w:hAnsi="Times New Roman" w:cs="Times New Roman"/>
-          <w:sz w:val="28"/>
-          <w:szCs w:val="28"/>
-        </w:rPr>
-        <w:br/>
-        <w:t>- доделать админ панель;</w:t>
-      </w:r>
-      <w:r>
-        <w:rPr>
-          <w:rStyle w:val="translatable-message"/>
-          <w:rFonts w:ascii="Times New Roman" w:hAnsi="Times New Roman" w:cs="Times New Roman"/>
-          <w:sz w:val="28"/>
-          <w:szCs w:val="28"/>
-        </w:rPr>
-        <w:br/>
-        <w:t xml:space="preserve">- реализовать </w:t>
-      </w:r>
-      <w:r>
-        <w:rPr>
-          <w:rStyle w:val="translatable-message"/>
-          <w:rFonts w:ascii="Times New Roman" w:hAnsi="Times New Roman" w:cs="Times New Roman"/>
-          <w:sz w:val="28"/>
-          <w:szCs w:val="28"/>
-        </w:rPr>
-        <w:t xml:space="preserve"> </w:t>
-      </w:r>
-      <w:r>
-        <w:rPr>
-          <w:rStyle w:val="translatable-message"/>
-          <w:rFonts w:ascii="Times New Roman" w:hAnsi="Times New Roman" w:cs="Times New Roman"/>
-          <w:sz w:val="28"/>
-          <w:szCs w:val="28"/>
-        </w:rPr>
-        <w:t>сценарий редактирования обложки в редакторе изображений;</w:t>
-      </w:r>
-      <w:r>
-        <w:rPr>
-          <w:rStyle w:val="translatable-message"/>
-          <w:rFonts w:ascii="Times New Roman" w:hAnsi="Times New Roman" w:cs="Times New Roman"/>
-          <w:sz w:val="28"/>
-          <w:szCs w:val="28"/>
-        </w:rPr>
-        <w:br/>
-        <w:t>- покрыть тестами сценарии просмотр обложек и генерация;</w:t>
-      </w:r>
-      <w:r>
-        <w:rPr>
-          <w:rStyle w:val="translatable-message"/>
-          <w:rFonts w:ascii="Times New Roman" w:hAnsi="Times New Roman" w:cs="Times New Roman"/>
-          <w:sz w:val="28"/>
-          <w:szCs w:val="28"/>
-        </w:rPr>
-        <w:br/>
-        <w:t>- подключить систему сбора метрик.</w:t>
-      </w:r>
     </w:p>
     <w:p>
       <w:pPr>

</xml_diff>